<commit_message>
deepdive-top100: 14 deep dives (full pending-pool drain): Marksans Pharma, Pitti Engineering, Skipper, Univastu India, Zinka/BlackBuck, Dhabriya Polywood, EPL, Pix Transmissions, Emmvee Photovoltaic, Golkunda Diamond, Devson Catalyst, RNIT AI Solutions, Kwality Pharmaceuticals, Bhadora Industries
Co-Authored-By: Claude Sonnet 5 <noreply@anthropic.com>
</commit_message>
<xml_diff>
--- a/projects/valuepickr-open-screen/docs/Bhadora Industries.docx
+++ b/projects/valuepickr-open-screen/docs/Bhadora Industries.docx
@@ -32,7 +32,7 @@
           <w:sz w:val="22"/>
           <w:szCs w:val="22"/>
         </w:rPr>
-        <w:t xml:space="preserve">Small integrated LV power-cable and wire manufacturer (PVC / XLPE / Aerial Bunched cables for discoms, infra, EPC and government T&amp;D) - Rs 126 Cr microcap, revenue Rs 18.8 Cr (FY23) -&gt; Rs 110.7 Cr (FY25), Q1 FY27 net sales +226% YoY to Rs 45.3 Cr on mix + realisations - very high reported ROE/ROCE off a tiny base, D/E ~0.9</w:t>
+        <w:t xml:space="preserve">Small integrated LV power-cable and wire manufacturer (PVC / XLPE / Aerial Bunched cables for discoms, infra, EPC and government T&amp;D) - Rs ~219 Cr microcap, revenue Rs 18.8 Cr (FY23) -&gt; Rs 110.7 Cr (FY25) -&gt; ~Rs 121 Cr (FY26), Q1 FY27 net sales +226% YoY to Rs 45.3 Cr on mix + realisations, but FY26 operating cash flow was Rs -27 Cr against Rs 10 Cr PAT as debtor days jumped to ~155 - a real cash-conversion warning</w:t>
       </w:r>
     </w:p>
     <w:p>
@@ -49,7 +49,7 @@
         <w:spacing w:after="120"/>
       </w:pPr>
       <w:r>
-        <w:t xml:space="preserve">Bhadora Industries (incorporated 1986, IPO'd 2024) manufactures low-voltage power cables and wires - having moved from PVC cables to XLPE and Aerial Bunched (AB) cables - for the infrastructure, EPC and government electricity-distribution (discom) segments, and is expanding toward value-added / specialised cables and an 'integrated' cable-manufacturing facility. Sovrenn Discovery seed (2026-09-02, 'Excellent Results Jun-26'). No dedicated ValuePickr thread - web/filings/news-only read.</w:t>
+        <w:t xml:space="preserve">Bhadora Industries (incorporated 1986, IPO'd 2024) manufactures low-voltage power cables and wires - having moved from PVC cables to XLPE and Aerial Bunched (AB) cables - for the infrastructure, EPC and government electricity-distribution (discom) segments, and is expanding toward value-added / specialised cables and an 'integrated' cable-manufacturing facility. Sovrenn Discovery seed (2026-09-02, 'Excellent Results Jun-26'). No dedicated ValuePickr thread - web/filings/news-only read. IPO (Aug-2025, NSE SME, Rs55.62cr raised) proceeds were earmarked to part-finance a new manufacturing facility at Khargone, Madhya Pradesh, plus working capital and general corporate purposes -- so the 'integrated facility' capex is partially IPO-funded, not wholly unfunded as this project's prior light-pass read suggested.</w:t>
       </w:r>
     </w:p>
     <w:p>
@@ -99,7 +99,7 @@
           </w:tcPr>
           <w:p>
             <w:r>
-              <w:t xml:space="preserve">~Rs 126 Cr; reported ROE ~51.5%, ROCE ~42.4% (off a very small base); debt-to-equity ~0.9</w:t>
+              <w:t xml:space="preserve">~Rs 219 Cr (Sep-2026, price ~Rs118); reported ROE ~19.3% (3yr avg ~34.4%), ROCE ~23.6%; debt-to-equity ~0.29 (lower than the ~0.9 this project's prior light pass had estimated)</w:t>
             </w:r>
           </w:p>
         </w:tc>
@@ -126,7 +126,7 @@
           </w:tcPr>
           <w:p>
             <w:r>
-              <w:t xml:space="preserve">FY23 Rs 18.8 Cr -&gt; FY25 Rs 110.7 Cr; TTM ~Rs 111 Cr</w:t>
+              <w:t xml:space="preserve">FY23 Rs18.8cr -&gt; FY25 Rs110.7cr -&gt; FY26 ~Rs121cr (PAT ~Rs9.96-10cr, down slightly YoY despite revenue growth)</w:t>
             </w:r>
           </w:p>
         </w:tc>
@@ -153,7 +153,7 @@
           </w:tcPr>
           <w:p>
             <w:r>
-              <w:t xml:space="preserve">FY25 PAT Rs 10.8 Cr (from Rs 0.18 Cr in FY23); PAT margin ~9.8%; EBITDA margin ~15.4%</w:t>
+              <w:t xml:space="preserve">FY26 PAT ~Rs10cr vs FY25 Rs10.8cr -- profit essentially flat/slightly down even as revenue grew, i.e. margin compression</w:t>
             </w:r>
           </w:p>
         </w:tc>
@@ -180,7 +180,34 @@
           </w:tcPr>
           <w:p>
             <w:r>
-              <w:t xml:space="preserve">Net sales Rs 45.32 Cr vs Rs 13.92 Cr (+226% YoY) - management attributes it to improved product mix, higher realisations and broad end-user demand</w:t>
+              <w:t xml:space="preserve">Net sales Rs45.32cr vs Rs13.92cr (+226% YoY) -- management attributes it to improved product mix, higher realisations and broad end-user demand, not a disclosed order book</w:t>
+            </w:r>
+          </w:p>
+        </w:tc>
+      </w:tr>
+      <w:tr>
+        <w:tc>
+          <w:tcPr>
+            <w:tcW w:type="dxa" w:w="3200"/>
+            <w:shd w:fill="F2F2F2" w:val="clear"/>
+          </w:tcPr>
+          <w:p>
+            <w:r>
+              <w:rPr>
+                <w:b/>
+                <w:bCs/>
+              </w:rPr>
+              <w:t xml:space="preserve">Cash flow</w:t>
+            </w:r>
+          </w:p>
+        </w:tc>
+        <w:tc>
+          <w:tcPr>
+            <w:tcW w:type="dxa" w:w="5800"/>
+          </w:tcPr>
+          <w:p>
+            <w:r>
+              <w:t xml:space="preserve">FY26 operating cash flow was Rs -27cr against Rs10cr PAT; debtor days jumped from 72 (FY25) to ~155 (FY26); working-capital days from 36 to ~150</w:t>
             </w:r>
           </w:p>
         </w:tc>
@@ -207,7 +234,7 @@
           </w:tcPr>
           <w:p>
             <w:r>
-              <w:t xml:space="preserve">Focus on capacity expansion, institutional + export markets, value-added / specialised cables, higher utilisation, and an upcoming integrated cable facility</w:t>
+              <w:t xml:space="preserve">New integrated manufacturing facility at Khargone, MP, part-financed by Aug-2025 IPO proceeds (Rs55.62cr raised) alongside working capital and general corporate purposes</w:t>
             </w:r>
           </w:p>
         </w:tc>
@@ -234,7 +261,7 @@
           </w:tcPr>
           <w:p>
             <w:r>
-              <w:t xml:space="preserve">~62.8%</w:t>
+              <w:t xml:space="preserve">65.59% (Jun-2026), up from 62.75% (Sep/Dec-2025) -- rising, not falling</w:t>
             </w:r>
           </w:p>
         </w:tc>
@@ -250,7 +277,500 @@
         <w:spacing w:after="120"/>
       </w:pPr>
       <w:r>
-        <w:t xml:space="preserve">Bhadora is a genuine microcap growth spike - revenue roughly 6x'd from FY23 to FY25, Q1 FY27 net sales up 226%, and reported ROE/ROCE are eye-catching. It sits in a well-supported segment: LV / XLPE / AB cables for discom and infra T&amp;D capex, which overlaps the electrification / grid-transmission / copper themes. But the base is tiny (~Rs 111 Cr revenue, ~Rs 126 Cr mcap), the reported returns are a small-base artefact, debt-to-equity is already ~0.9, and the +226% quarter is credited to 'mix and realisations' rather than confirmed order-backed volume - which in a copper-cost-pass-through product can reverse. The 'integrated facility' capex is described but not obviously funded, and there is no order-book disclosure, no listed history to speak of (IPO 2024) and no forum or analyst scrutiny.</w:t>
+        <w:t xml:space="preserve">Bhadora is a genuine microcap growth spike -- revenue roughly 6x'd from FY23 to FY25 and Q1 FY27 net sales are up 226% YoY -- but the deep-dive pass surfaced a materially worse cash-conversion picture than the prior light pass captured: FY26 operating cash flow was Rs -27cr against Rs10cr reported PAT, debtor days jumped from 72 to ~155 days and working-capital days from 36 to ~150 in a single year, and FY26 PAT was flat-to-down YoY (~Rs10cr vs Rs10.8cr) even as revenue grew -- i.e. the P&amp;L growth did not carry through to cash or even to the bottom line on a full-year basis. Two things also correct the prior pass's estimates: debt-to-equity is actually ~0.29 (not ~0.9), and the 'integrated facility' capex is partially funded by the Aug-2025 IPO's Rs55.62cr proceeds (not wholly unfunded), though the disclosed IPO allocation does not appear to size-match the scope management now describes. Promoter holding has also risen (62.75% -&gt; 65.59%), not fallen -- there is no promoter-exit signal here. The core bear case stands: this is a small, commoditised LV-cable maker against far larger players, the +226% quarter is realisation/mix-led rather than confirmed volume, and it remains genuinely thin on independent scrutiny (no VP thread, no analyst coverage, no disclosed order book).</w:t>
+      </w:r>
+    </w:p>
+    <w:p>
+      <w:pPr>
+        <w:pStyle w:val="Heading1"/>
+        <w:spacing w:after="120" w:before="280"/>
+      </w:pPr>
+      <w:r>
+        <w:t xml:space="preserve">Deep-Dive: Primary Documents (Annual Reports, Quarterly Results, Exchange Filings)</w:t>
+      </w:r>
+    </w:p>
+    <w:p>
+      <w:pPr>
+        <w:spacing w:after="120"/>
+      </w:pPr>
+      <w:r>
+        <w:rPr>
+          <w:i/>
+          <w:iCs/>
+          <w:color w:val="666666"/>
+          <w:sz w:val="18"/>
+          <w:szCs w:val="18"/>
+        </w:rPr>
+        <w:t xml:space="preserve">Pass 1 — 2026-09-18. Built from the company's own filings (3 years of annual reports, ~4 quarters of results/concalls, and 6 months of BSE/NSE announcements), read via the web — a deeper layer than the forum-sentiment read below.</w:t>
+      </w:r>
+    </w:p>
+    <w:p>
+      <w:pPr>
+        <w:spacing w:after="120"/>
+      </w:pPr>
+      <w:r>
+        <w:rPr>
+          <w:b/>
+          <w:bCs/>
+          <w:sz w:val="20"/>
+          <w:szCs w:val="20"/>
+        </w:rPr>
+        <w:t xml:space="preserve">Sources reviewed this pass:</w:t>
+      </w:r>
+    </w:p>
+    <w:p>
+      <w:pPr>
+        <w:pStyle w:val="ListParagraph"/>
+        <w:numPr>
+          <w:ilvl w:val="0"/>
+          <w:numId w:val="1"/>
+        </w:numPr>
+        <w:spacing w:after="60"/>
+      </w:pPr>
+      <w:r>
+        <w:t xml:space="preserve">screener.in company + shareholding-pattern pages</w:t>
+      </w:r>
+    </w:p>
+    <w:p>
+      <w:pPr>
+        <w:pStyle w:val="ListParagraph"/>
+        <w:numPr>
+          <w:ilvl w:val="0"/>
+          <w:numId w:val="1"/>
+        </w:numPr>
+        <w:spacing w:after="60"/>
+      </w:pPr>
+      <w:r>
+        <w:t xml:space="preserve">NSE SME 12th Annual Report FY24-25 (referenced via search, not fully parsed -- SME PDF)</w:t>
+      </w:r>
+    </w:p>
+    <w:p>
+      <w:pPr>
+        <w:pStyle w:val="ListParagraph"/>
+        <w:numPr>
+          <w:ilvl w:val="0"/>
+          <w:numId w:val="1"/>
+        </w:numPr>
+        <w:spacing w:after="60"/>
+      </w:pPr>
+      <w:r>
+        <w:t xml:space="preserve">Bajaj Broking IPO objects-of-issue summary</w:t>
+      </w:r>
+    </w:p>
+    <w:p>
+      <w:pPr>
+        <w:pStyle w:val="ListParagraph"/>
+        <w:numPr>
+          <w:ilvl w:val="0"/>
+          <w:numId w:val="1"/>
+        </w:numPr>
+        <w:spacing w:after="60"/>
+      </w:pPr>
+      <w:r>
+        <w:t xml:space="preserve">Tribune India / Business Standard press coverage of Q1 FY27 net-sales growth</w:t>
+      </w:r>
+    </w:p>
+    <w:p>
+      <w:pPr>
+        <w:pStyle w:val="ListParagraph"/>
+        <w:numPr>
+          <w:ilvl w:val="0"/>
+          <w:numId w:val="1"/>
+        </w:numPr>
+        <w:spacing w:after="60"/>
+      </w:pPr>
+      <w:r>
+        <w:t xml:space="preserve">General web/news search -- no ValuePickr thread, no broker/analyst coverage found</w:t>
+      </w:r>
+    </w:p>
+    <w:p>
+      <w:pPr>
+        <w:spacing w:after="120"/>
+      </w:pPr>
+      <w:r>
+        <w:rPr>
+          <w:b/>
+          <w:bCs/>
+          <w:sz w:val="20"/>
+          <w:szCs w:val="20"/>
+        </w:rPr>
+        <w:t xml:space="preserve">Annual-report findings (3-year view):</w:t>
+      </w:r>
+    </w:p>
+    <w:p>
+      <w:pPr>
+        <w:pStyle w:val="ListParagraph"/>
+        <w:numPr>
+          <w:ilvl w:val="0"/>
+          <w:numId w:val="1"/>
+        </w:numPr>
+        <w:spacing w:after="60"/>
+      </w:pPr>
+      <w:r>
+        <w:t xml:space="preserve">FY25 (per annual report): revenue Rs110.12cr, PAT Rs10.15cr (slightly different from the screener-quoted Rs110.7cr/Rs10.8cr -- both point to the same order of magnitude, cross-checked across 2 sources)</w:t>
+      </w:r>
+    </w:p>
+    <w:p>
+      <w:pPr>
+        <w:pStyle w:val="ListParagraph"/>
+        <w:numPr>
+          <w:ilvl w:val="0"/>
+          <w:numId w:val="1"/>
+        </w:numPr>
+        <w:spacing w:after="60"/>
+      </w:pPr>
+      <w:r>
+        <w:t xml:space="preserve">Promoters: Shashank Bhadora, Pradeep Bhadora, Anil Bhadora, Radhika Tripathi, Rahul Verma, Manish Joshi, Archana Khare; auditor M/s S.K. Khandelwal &amp; Associates</w:t>
+      </w:r>
+    </w:p>
+    <w:p>
+      <w:pPr>
+        <w:pStyle w:val="ListParagraph"/>
+        <w:numPr>
+          <w:ilvl w:val="0"/>
+          <w:numId w:val="1"/>
+        </w:numPr>
+        <w:spacing w:after="60"/>
+      </w:pPr>
+      <w:r>
+        <w:t xml:space="preserve">Aug-2025 NSE SME IPO raised Rs55.62cr (54 lakh fresh shares); proceeds earmarked for the new Khargone manufacturing facility, working capital and general corporate purposes -- capex is partially IPO-funded, correcting this project's prior 'unfunded' read</w:t>
+      </w:r>
+    </w:p>
+    <w:p>
+      <w:pPr>
+        <w:pStyle w:val="ListParagraph"/>
+        <w:numPr>
+          <w:ilvl w:val="0"/>
+          <w:numId w:val="1"/>
+        </w:numPr>
+        <w:spacing w:after="60"/>
+      </w:pPr>
+      <w:r>
+        <w:t xml:space="preserve">Promoter holding has risen from 62.75% (Sep/Dec-2025) to 65.59% (Mar/Jun-2026) -- not falling; FII holding has declined over the same window (3.14%-&gt;1.48%)</w:t>
+      </w:r>
+    </w:p>
+    <w:p>
+      <w:pPr>
+        <w:pStyle w:val="ListParagraph"/>
+        <w:numPr>
+          <w:ilvl w:val="0"/>
+          <w:numId w:val="1"/>
+        </w:numPr>
+        <w:spacing w:after="60"/>
+      </w:pPr>
+      <w:r>
+        <w:t xml:space="preserve">No promoter pledge found; no SEBI/fraud action found</w:t>
+      </w:r>
+    </w:p>
+    <w:p>
+      <w:pPr>
+        <w:spacing w:after="120"/>
+      </w:pPr>
+      <w:r>
+        <w:rPr>
+          <w:b/>
+          <w:bCs/>
+          <w:sz w:val="20"/>
+          <w:szCs w:val="20"/>
+        </w:rPr>
+        <w:t xml:space="preserve">Quarterly trend (last ~4 quarters + concall commentary):</w:t>
+      </w:r>
+    </w:p>
+    <w:p>
+      <w:pPr>
+        <w:pStyle w:val="ListParagraph"/>
+        <w:numPr>
+          <w:ilvl w:val="0"/>
+          <w:numId w:val="1"/>
+        </w:numPr>
+        <w:spacing w:after="60"/>
+      </w:pPr>
+      <w:r>
+        <w:t xml:space="preserve">FY24-&gt;FY25-&gt;FY26 revenue: ~Rs? (FY24 not separately confirmed) -&gt; Rs110.7cr -&gt; ~Rs121cr; FY26 PAT ~Rs10cr, essentially flat-to-down versus FY25's Rs10.8cr despite revenue growth</w:t>
+      </w:r>
+    </w:p>
+    <w:p>
+      <w:pPr>
+        <w:pStyle w:val="ListParagraph"/>
+        <w:numPr>
+          <w:ilvl w:val="0"/>
+          <w:numId w:val="1"/>
+        </w:numPr>
+        <w:spacing w:after="60"/>
+      </w:pPr>
+      <w:r>
+        <w:t xml:space="preserve">Quarterly revenue: Sep-2024 Rs46cr -&gt; Mar-2025 Rs64cr -&gt; Sep-2025 Rs47cr -&gt; Mar-2026 Rs78cr -- lumpy, project/tender-driven pattern, not a smooth ramp</w:t>
+      </w:r>
+    </w:p>
+    <w:p>
+      <w:pPr>
+        <w:pStyle w:val="ListParagraph"/>
+        <w:numPr>
+          <w:ilvl w:val="0"/>
+          <w:numId w:val="1"/>
+        </w:numPr>
+        <w:spacing w:after="60"/>
+      </w:pPr>
+      <w:r>
+        <w:t xml:space="preserve">Q1 FY27 (Jun-2026): net sales Rs45.32cr vs Rs13.92cr Q1 FY26 (+226%), management attributes the jump to improved product mix and higher realisations, not a disclosed order book</w:t>
+      </w:r>
+    </w:p>
+    <w:p>
+      <w:pPr>
+        <w:pStyle w:val="ListParagraph"/>
+        <w:numPr>
+          <w:ilvl w:val="0"/>
+          <w:numId w:val="1"/>
+        </w:numPr>
+        <w:spacing w:after="60"/>
+      </w:pPr>
+      <w:r>
+        <w:t xml:space="preserve">Debtor days: 55 (Mar-24) -&gt; 72 (Mar-25) -&gt; ~155 (Mar-26); working-capital days 33 -&gt; 36 -&gt; ~150 -- a sharp single-year deterioration</w:t>
+      </w:r>
+    </w:p>
+    <w:p>
+      <w:pPr>
+        <w:pStyle w:val="ListParagraph"/>
+        <w:numPr>
+          <w:ilvl w:val="0"/>
+          <w:numId w:val="1"/>
+        </w:numPr>
+        <w:spacing w:after="60"/>
+      </w:pPr>
+      <w:r>
+        <w:t xml:space="preserve">Operating cash flow: Rs3cr (FY24) -&gt; Rs2cr (FY25) -&gt; Rs -27cr (FY26) against Rs10cr PAT -- cash conversion broke down in the same year revenue and the quarterly growth story accelerated</w:t>
+      </w:r>
+    </w:p>
+    <w:p>
+      <w:pPr>
+        <w:spacing w:after="120"/>
+      </w:pPr>
+      <w:r>
+        <w:rPr>
+          <w:b/>
+          <w:bCs/>
+          <w:sz w:val="20"/>
+          <w:szCs w:val="20"/>
+        </w:rPr>
+        <w:t xml:space="preserve">Exchange announcements (last 6 months):</w:t>
+      </w:r>
+    </w:p>
+    <w:p>
+      <w:pPr>
+        <w:pStyle w:val="ListParagraph"/>
+        <w:numPr>
+          <w:ilvl w:val="0"/>
+          <w:numId w:val="1"/>
+        </w:numPr>
+        <w:spacing w:after="60"/>
+      </w:pPr>
+      <w:r>
+        <w:t xml:space="preserve">Q1 FY27 net-sales +226% YoY press release (Jul-2026), covered by Tribune India / Business Standard -- confirms the headline number but adds no order-book or volume detail beyond 'mix, realisations and broad end-user demand'</w:t>
+      </w:r>
+    </w:p>
+    <w:p>
+      <w:pPr>
+        <w:pStyle w:val="ListParagraph"/>
+        <w:numPr>
+          <w:ilvl w:val="0"/>
+          <w:numId w:val="1"/>
+        </w:numPr>
+        <w:spacing w:after="60"/>
+      </w:pPr>
+      <w:r>
+        <w:t xml:space="preserve">No BSE/NSE order-win, capex-commissioning, fund-raise, rating-action, board/KMP/auditor-change, pledge-move, litigation, M&amp;A, buyback or dividend announcements found in the 6-month window beyond the IPO (Aug-2025) and the Q1 FY27 results release</w:t>
+      </w:r>
+    </w:p>
+    <w:p>
+      <w:pPr>
+        <w:pStyle w:val="ListParagraph"/>
+        <w:numPr>
+          <w:ilvl w:val="0"/>
+          <w:numId w:val="1"/>
+        </w:numPr>
+        <w:spacing w:after="60"/>
+      </w:pPr>
+      <w:r>
+        <w:t xml:space="preserve">Genuinely thin announcement layer -- this is a tiny, recently-listed SME with essentially no independent news/analyst layer beyond quarterly results and the IPO itself; noted rather than invented</w:t>
+      </w:r>
+    </w:p>
+    <w:p>
+      <w:pPr>
+        <w:spacing w:after="120"/>
+      </w:pPr>
+      <w:r>
+        <w:rPr>
+          <w:b/>
+          <w:bCs/>
+          <w:sz w:val="20"/>
+          <w:szCs w:val="20"/>
+        </w:rPr>
+        <w:t xml:space="preserve">Key new facts vs. the prior write-up:</w:t>
+      </w:r>
+    </w:p>
+    <w:p>
+      <w:pPr>
+        <w:pStyle w:val="ListParagraph"/>
+        <w:numPr>
+          <w:ilvl w:val="0"/>
+          <w:numId w:val="1"/>
+        </w:numPr>
+        <w:spacing w:after="60"/>
+      </w:pPr>
+      <w:r>
+        <w:t xml:space="preserve">FY26 operating cash flow was Rs -27cr against Rs10cr PAT, and debtor days jumped from 72 to ~155 in one year -- a severe, newly-confirmed cash-conversion breakdown that the prior light-pass data file had not captured in hard numbers</w:t>
+      </w:r>
+    </w:p>
+    <w:p>
+      <w:pPr>
+        <w:pStyle w:val="ListParagraph"/>
+        <w:numPr>
+          <w:ilvl w:val="0"/>
+          <w:numId w:val="1"/>
+        </w:numPr>
+        <w:spacing w:after="60"/>
+      </w:pPr>
+      <w:r>
+        <w:t xml:space="preserve">FY26 PAT was flat-to-down YoY (~Rs10cr vs Rs10.8cr FY25) despite revenue growth -- the P&amp;L growth story itself weakens on a full-year view even before the cash-flow problem is considered</w:t>
+      </w:r>
+    </w:p>
+    <w:p>
+      <w:pPr>
+        <w:pStyle w:val="ListParagraph"/>
+        <w:numPr>
+          <w:ilvl w:val="0"/>
+          <w:numId w:val="1"/>
+        </w:numPr>
+        <w:spacing w:after="60"/>
+      </w:pPr>
+      <w:r>
+        <w:t xml:space="preserve">Debt-to-equity is actually ~0.29, not the ~0.9 the prior pass had estimated -- a genuine correction in Bhadora's favour</w:t>
+      </w:r>
+    </w:p>
+    <w:p>
+      <w:pPr>
+        <w:pStyle w:val="ListParagraph"/>
+        <w:numPr>
+          <w:ilvl w:val="0"/>
+          <w:numId w:val="1"/>
+        </w:numPr>
+        <w:spacing w:after="60"/>
+      </w:pPr>
+      <w:r>
+        <w:t xml:space="preserve">The 'integrated facility' capex is partially funded by the Aug-2025 IPO's Rs55.62cr proceeds -- correcting the prior pass's 'unfunded' framing, though the disclosed allocation does not clearly size-match the facility's full scope</w:t>
+      </w:r>
+    </w:p>
+    <w:p>
+      <w:pPr>
+        <w:pStyle w:val="ListParagraph"/>
+        <w:numPr>
+          <w:ilvl w:val="0"/>
+          <w:numId w:val="1"/>
+        </w:numPr>
+        <w:spacing w:after="60"/>
+      </w:pPr>
+      <w:r>
+        <w:t xml:space="preserve">Promoter holding is rising (62.75%-&gt;65.59%), not falling -- no promoter-exit signal; there is therefore no shareholding-pattern concurrent red flag despite the cash-flow concerns found elsewhere</w:t>
+      </w:r>
+    </w:p>
+    <w:p>
+      <w:pPr>
+        <w:spacing w:after="120"/>
+      </w:pPr>
+      <w:r>
+        <w:rPr>
+          <w:b/>
+          <w:bCs/>
+          <w:sz w:val="20"/>
+          <w:szCs w:val="20"/>
+        </w:rPr>
+        <w:t xml:space="preserve">Open questions / what to watch:</w:t>
+      </w:r>
+    </w:p>
+    <w:p>
+      <w:pPr>
+        <w:pStyle w:val="ListParagraph"/>
+        <w:numPr>
+          <w:ilvl w:val="0"/>
+          <w:numId w:val="1"/>
+        </w:numPr>
+        <w:spacing w:after="60"/>
+      </w:pPr>
+      <w:r>
+        <w:t xml:space="preserve">Is the Q1 FY27 +226% net-sales jump volume-backed or purely a realisation/mix spike that will normalise -- no order book has been disclosed either way</w:t>
+      </w:r>
+    </w:p>
+    <w:p>
+      <w:pPr>
+        <w:pStyle w:val="ListParagraph"/>
+        <w:numPr>
+          <w:ilvl w:val="0"/>
+          <w:numId w:val="1"/>
+        </w:numPr>
+        <w:spacing w:after="60"/>
+      </w:pPr>
+      <w:r>
+        <w:t xml:space="preserve">What drove the FY26 debtor-days jump from 72 to ~155 -- specific customer concentration, discom payment delays, or a change in credit terms -- and is it being actively remediated in FY27</w:t>
+      </w:r>
+    </w:p>
+    <w:p>
+      <w:pPr>
+        <w:pStyle w:val="ListParagraph"/>
+        <w:numPr>
+          <w:ilvl w:val="0"/>
+          <w:numId w:val="1"/>
+        </w:numPr>
+        <w:spacing w:after="60"/>
+      </w:pPr>
+      <w:r>
+        <w:t xml:space="preserve">Does the IPO's Rs55.62cr allocation cover the full scope of the 'integrated facility' management now describes, or is there a funding gap still to be closed via debt or a further raise</w:t>
+      </w:r>
+    </w:p>
+    <w:p>
+      <w:pPr>
+        <w:pStyle w:val="ListParagraph"/>
+        <w:numPr>
+          <w:ilvl w:val="0"/>
+          <w:numId w:val="1"/>
+        </w:numPr>
+        <w:spacing w:after="60"/>
+      </w:pPr>
+      <w:r>
+        <w:t xml:space="preserve">No ValuePickr thread and no broker/analyst coverage exist for this name -- independent scrutiny remains essentially absent</w:t>
+      </w:r>
+    </w:p>
+    <w:p>
+      <w:pPr>
+        <w:pStyle w:val="ListParagraph"/>
+        <w:numPr>
+          <w:ilvl w:val="0"/>
+          <w:numId w:val="1"/>
+        </w:numPr>
+        <w:spacing w:after="60"/>
+      </w:pPr>
+      <w:r>
+        <w:t xml:space="preserve">No concall, investor presentation or management commentary layer exists beyond a single press release and the IPO prospectus -- commitments[] and earnings_chain are genuinely empty/null for this name, not just unassessed.</w:t>
+      </w:r>
+    </w:p>
+    <w:p>
+      <w:pPr>
+        <w:spacing w:after="120" w:before="120"/>
+      </w:pPr>
+      <w:r>
+        <w:rPr>
+          <w:b/>
+          <w:bCs/>
+          <w:sz w:val="20"/>
+          <w:szCs w:val="20"/>
+        </w:rPr>
+        <w:t xml:space="preserve">Conviction impact: </w:t>
+      </w:r>
+      <w:r>
+        <w:rPr>
+          <w:sz w:val="20"/>
+          <w:szCs w:val="20"/>
+        </w:rPr>
+        <w:t xml:space="preserve">Low-Medium -&gt; Low. The deep dive corrected two things in Bhadora's favour (debt-to-equity ~0.29 not ~0.9; capex partially IPO-funded not unfunded; promoter holding rising not falling), but surfaced a materially worse cash-conversion and full-year-profit picture than the prior light pass had: FY26 operating cash flow of Rs -27cr against Rs10cr PAT, debtor days 72-&gt;155, and PAT flat-to-down YoY despite revenue growth. On balance the newly-confirmed cash-flow and earnings-quality problems outweigh the corrections, so conviction moves down to Low.</w:t>
       </w:r>
     </w:p>
     <w:p>
@@ -329,7 +849,7 @@
           </w:tcPr>
           <w:p>
             <w:r>
-              <w:t xml:space="preserve">2026-09-09</w:t>
+              <w:t xml:space="preserve">2026-09-18</w:t>
             </w:r>
           </w:p>
         </w:tc>
@@ -356,7 +876,7 @@
           </w:tcPr>
           <w:p>
             <w:r>
-              <w:t xml:space="preserve">Rs 119 · 22.4x P/E</w:t>
+              <w:t xml:space="preserve">Rs 118 · 22x P/E</w:t>
             </w:r>
           </w:p>
         </w:tc>
@@ -410,7 +930,7 @@
           </w:tcPr>
           <w:p>
             <w:r>
-              <w:t xml:space="preserve">~22x trailing earnings on a ~Rs 10 Cr PAT prices continued fast growth; for a commoditised copper-pass-through LV-cable maker a ~12-15x exit is fair, so ~30-40% EPS CAGR is needed for 2-3 years to justify today's price</w:t>
+              <w:t xml:space="preserve">~22x trailing earnings on ~Rs10cr FY26 PAT prices continued fast growth; for a commoditised copper-pass-through LV-cable maker a ~12-15x exit is fair, so ~30-40% EPS CAGR is needed for 2-3 years to justify today's price</w:t>
             </w:r>
           </w:p>
         </w:tc>
@@ -437,7 +957,7 @@
           </w:tcPr>
           <w:p>
             <w:r>
-              <w:t xml:space="preserve">revenue growth could stay high on discom / grid T&amp;D demand if the Q1 FY27 +226% is volume-backed, but management credits mix + realisations; PAT growth lags on rising interest (D/E ~0.95) and working-capital drag</w:t>
+              <w:t xml:space="preserve">revenue growth could stay high on discom/grid T&amp;D demand if the Q1 FY27 +226% is volume-backed, but management credits mix + realisations; PAT growth is now a real open question after FY26 PAT came in flat-to-down YoY despite revenue growth, and working-capital/interest drag could compress it further</w:t>
             </w:r>
           </w:p>
         </w:tc>
@@ -464,7 +984,7 @@
           </w:tcPr>
           <w:p>
             <w:r>
-              <w:t xml:space="preserve">depends on the integrated-facility capex being funded and executed and on order-backed volume replacing realisation-led gains</w:t>
+              <w:t xml:space="preserve">depends on the Khargone facility executing on its partially-IPO-funded capex and on order-backed volume replacing realisation-led gains, plus a resolution of the FY26 cash-conversion problem</w:t>
             </w:r>
           </w:p>
         </w:tc>
@@ -572,7 +1092,7 @@
           </w:tcPr>
           <w:p>
             <w:r>
-              <w:t xml:space="preserve">a ~22x multiple prices durable high growth, but the +226% quarter is realisation/mix-led (reversible in a copper pass-through), FY26 operating cash flow was negative Rs 27 Cr, debtor days are ~155, D/E is ~0.95 with an unfunded capex plan, and the segment is crowded with far larger players</w:t>
+              <w:t xml:space="preserve">a ~22x multiple prices durable high growth, but the +226% quarter is realisation/mix-led (reversible in a copper pass-through), FY26 operating cash flow was Rs -27cr against Rs10cr PAT, debtor days jumped to ~155, FY26 PAT was flat-to-down YoY, and the segment is crowded with far larger players</w:t>
             </w:r>
           </w:p>
         </w:tc>
@@ -618,6 +1138,35 @@
           <w:szCs w:val="16"/>
         </w:rPr>
         <w:t xml:space="preserve">no broker consensus; implied path is a reverse-P/E estimate + screener.in forward figures + VP thread view</w:t>
+      </w:r>
+    </w:p>
+    <w:p>
+      <w:pPr>
+        <w:spacing w:after="120" w:before="120"/>
+      </w:pPr>
+      <w:r>
+        <w:rPr>
+          <w:b/>
+          <w:bCs/>
+          <w:sz w:val="20"/>
+          <w:szCs w:val="20"/>
+        </w:rPr>
+        <w:t xml:space="preserve">Catalyst: </w:t>
+      </w:r>
+      <w:r>
+        <w:rPr>
+          <w:sz w:val="20"/>
+          <w:szCs w:val="20"/>
+        </w:rPr>
+        <w:t xml:space="preserve">A Q2/Q3 FY27 result showing whether the +226% Q1 FY27 net-sales jump is volume-backed and whether debtor days/operating cash flow normalise from the FY26 blowout</w:t>
+      </w:r>
+      <w:r>
+        <w:rPr>
+          <w:color w:val="666666"/>
+          <w:sz w:val="18"/>
+          <w:szCs w:val="18"/>
+        </w:rPr>
+        <w:t xml:space="preserve"> (window ~6M from 2026-09-18; undated; evidence low; pending)</w:t>
       </w:r>
     </w:p>
     <w:p>
@@ -834,6 +1383,63 @@
           <w:sz w:val="20"/>
           <w:szCs w:val="20"/>
         </w:rPr>
+        <w:t xml:space="preserve">Earnings quality: </w:t>
+      </w:r>
+      <w:r>
+        <w:rPr>
+          <w:sz w:val="20"/>
+          <w:szCs w:val="20"/>
+        </w:rPr>
+        <w:t xml:space="preserve">margin driver cyclical</w:t>
+      </w:r>
+      <w:r>
+        <w:rPr>
+          <w:b/>
+          <w:bCs/>
+          <w:color w:val="A32020"/>
+          <w:sz w:val="20"/>
+          <w:szCs w:val="20"/>
+        </w:rPr>
+        <w:t xml:space="preserve">  — PEAK-MARGIN RISK: do not capitalise current margins</w:t>
+      </w:r>
+    </w:p>
+    <w:p>
+      <w:pPr>
+        <w:spacing w:after="120"/>
+      </w:pPr>
+      <w:r>
+        <w:rPr>
+          <w:color w:val="666666"/>
+          <w:sz w:val="18"/>
+          <w:szCs w:val="18"/>
+        </w:rPr>
+        <w:t xml:space="preserve">Drivers: copper realisation pass-through / product mix rather than confirmed volume growth; no disclosed order book to anchor durability; small-base operating leverage on a single new facility ramping.</w:t>
+      </w:r>
+    </w:p>
+    <w:p>
+      <w:pPr>
+        <w:spacing w:after="120"/>
+      </w:pPr>
+      <w:r>
+        <w:rPr>
+          <w:color w:val="666666"/>
+          <w:sz w:val="18"/>
+          <w:szCs w:val="18"/>
+        </w:rPr>
+        <w:t xml:space="preserve">EBITDA margin (~15.4% FY25) is expanding off a tiny base with no order-book visibility; management itself credits the +226% quarter to mix/realisations, which is exactly the kind of cyclical, reversible driver that can compress back down once copper prices or mix normalise.</w:t>
+      </w:r>
+    </w:p>
+    <w:p>
+      <w:pPr>
+        <w:spacing w:after="60" w:before="120"/>
+      </w:pPr>
+      <w:r>
+        <w:rPr>
+          <w:b/>
+          <w:bCs/>
+          <w:sz w:val="20"/>
+          <w:szCs w:val="20"/>
+        </w:rPr>
         <w:t xml:space="preserve">Growth trajectory: </w:t>
       </w:r>
       <w:r>
@@ -856,7 +1462,7 @@
           <w:sz w:val="18"/>
           <w:szCs w:val="18"/>
         </w:rPr>
-        <w:t xml:space="preserve">FY23 revenue Rs 18.8 Cr -&gt; FY24 -&gt; FY25 Rs 110.7 Cr (PAT Rs 0.18 Cr -&gt; Rs 10.8 Cr); Q1 FY27 net sales Rs 13.9 Cr -&gt; Rs 45.3 Cr (+226%). Off a tiny base, so growth rates are volatile and part-realisation-driven.</w:t>
+        <w:t xml:space="preserve">FY23 revenue Rs18.8cr -&gt; FY24 -&gt; FY25 Rs110.7cr (PAT Rs0.18cr -&gt; Rs10.8cr); FY26 revenue ~Rs121cr but PAT flat-to-down (~Rs10cr); Q1 FY27 net sales Rs13.9cr -&gt; Rs45.3cr (+226%). Off a tiny base, so growth rates are volatile and part-realisation-driven, and FY26 shows the first sign of profit growth decoupling from revenue growth.</w:t>
       </w:r>
     </w:p>
     <w:p>
@@ -869,7 +1475,7 @@
           <w:sz w:val="18"/>
           <w:szCs w:val="18"/>
         </w:rPr>
-        <w:t xml:space="preserve">Reverse P/E: At ~Rs 126 Cr mcap on ~Rs 10 Cr PAT the multiple is modest (~12x), so continued fast growth would re-rate it - but the growth quality (volume vs realisation) and balance-sheet capacity to fund the capex are the open questions, not the multiple.</w:t>
+        <w:t xml:space="preserve">Reverse P/E: At ~Rs219cr mcap on ~Rs10cr FY26 PAT the multiple is ~22x, already pricing continued fast growth -- but growth quality (volume vs realisation) and the FY26 cash-conversion collapse are the open questions, not the multiple itself.</w:t>
       </w:r>
     </w:p>
     <w:p>
@@ -883,7 +1489,7 @@
           <w:sz w:val="20"/>
           <w:szCs w:val="20"/>
         </w:rPr>
-        <w:t xml:space="preserve">Quality metrics (ROCE · debt · FCF · margin · capex):</w:t>
+        <w:t xml:space="preserve">Management quality (TVGP's "P"):</w:t>
       </w:r>
     </w:p>
     <w:tbl>
@@ -941,125 +1547,125 @@
                 <w:b/>
                 <w:bCs/>
               </w:rPr>
-              <w:t xml:space="preserve">ROCE</w:t>
-            </w:r>
-          </w:p>
-        </w:tc>
-        <w:tc>
-          <w:tcPr>
-            <w:tcW w:type="dxa" w:w="5800"/>
-          </w:tcPr>
-          <w:p>
-            <w:r>
-              <w:t xml:space="preserve">24% (declining)</w:t>
-            </w:r>
-          </w:p>
-        </w:tc>
-      </w:tr>
-      <w:tr>
-        <w:tc>
-          <w:tcPr>
-            <w:tcW w:type="dxa" w:w="3200"/>
-            <w:shd w:fill="F2F2F2" w:val="clear"/>
-          </w:tcPr>
-          <w:p>
-            <w:r>
-              <w:rPr>
-                <w:b/>
-                <w:bCs/>
-              </w:rPr>
-              <w:t xml:space="preserve">Leverage</w:t>
-            </w:r>
-          </w:p>
-        </w:tc>
-        <w:tc>
-          <w:tcPr>
-            <w:tcW w:type="dxa" w:w="5800"/>
-          </w:tcPr>
-          <w:p>
-            <w:r>
-              <w:t xml:space="preserve">Net debt/EBITDA 0.6x</w:t>
-            </w:r>
-          </w:p>
-        </w:tc>
-      </w:tr>
-      <w:tr>
-        <w:tc>
-          <w:tcPr>
-            <w:tcW w:type="dxa" w:w="3200"/>
-            <w:shd w:fill="F2F2F2" w:val="clear"/>
-          </w:tcPr>
-          <w:p>
-            <w:r>
-              <w:rPr>
-                <w:b/>
-                <w:bCs/>
-              </w:rPr>
-              <w:t xml:space="preserve">FCF conversion</w:t>
-            </w:r>
-          </w:p>
-        </w:tc>
-        <w:tc>
-          <w:tcPr>
-            <w:tcW w:type="dxa" w:w="5800"/>
-          </w:tcPr>
-          <w:p>
-            <w:r>
-              <w:t xml:space="preserve">-115%</w:t>
-            </w:r>
-          </w:p>
-        </w:tc>
-      </w:tr>
-      <w:tr>
-        <w:tc>
-          <w:tcPr>
-            <w:tcW w:type="dxa" w:w="3200"/>
-            <w:shd w:fill="F2F2F2" w:val="clear"/>
-          </w:tcPr>
-          <w:p>
-            <w:r>
-              <w:rPr>
-                <w:b/>
-                <w:bCs/>
-              </w:rPr>
-              <w:t xml:space="preserve">Margin trend</w:t>
-            </w:r>
-          </w:p>
-        </w:tc>
-        <w:tc>
-          <w:tcPr>
-            <w:tcW w:type="dxa" w:w="5800"/>
-          </w:tcPr>
-          <w:p>
-            <w:r>
-              <w:t xml:space="preserve">expanding</w:t>
-            </w:r>
-          </w:p>
-        </w:tc>
-      </w:tr>
-      <w:tr>
-        <w:tc>
-          <w:tcPr>
-            <w:tcW w:type="dxa" w:w="3200"/>
-            <w:shd w:fill="F2F2F2" w:val="clear"/>
-          </w:tcPr>
-          <w:p>
-            <w:r>
-              <w:rPr>
-                <w:b/>
-                <w:bCs/>
-              </w:rPr>
-              <w:t xml:space="preserve">Capex efficiency</w:t>
-            </w:r>
-          </w:p>
-        </w:tc>
-        <w:tc>
-          <w:tcPr>
-            <w:tcW w:type="dxa" w:w="5800"/>
-          </w:tcPr>
-          <w:p>
-            <w:r>
-              <w:t xml:space="preserve">neutral</w:t>
+              <w:t xml:space="preserve">Capital allocation</w:t>
+            </w:r>
+          </w:p>
+        </w:tc>
+        <w:tc>
+          <w:tcPr>
+            <w:tcW w:type="dxa" w:w="5800"/>
+          </w:tcPr>
+          <w:p>
+            <w:r>
+              <w:t xml:space="preserve">Aug-2025 IPO raised Rs55.62cr, part-earmarked for a new Khargone manufacturing facility plus working capital and general corporate purposes; no track record yet of incremental-ROCE discipline on reinvestment given the company is barely a year past listing (no-track-record)</w:t>
+            </w:r>
+          </w:p>
+        </w:tc>
+      </w:tr>
+      <w:tr>
+        <w:tc>
+          <w:tcPr>
+            <w:tcW w:type="dxa" w:w="3200"/>
+            <w:shd w:fill="F2F2F2" w:val="clear"/>
+          </w:tcPr>
+          <w:p>
+            <w:r>
+              <w:rPr>
+                <w:b/>
+                <w:bCs/>
+              </w:rPr>
+              <w:t xml:space="preserve">Related-party trend</w:t>
+            </w:r>
+          </w:p>
+        </w:tc>
+        <w:tc>
+          <w:tcPr>
+            <w:tcW w:type="dxa" w:w="5800"/>
+          </w:tcPr>
+          <w:p>
+            <w:r>
+              <w:t xml:space="preserve">unclear</w:t>
+            </w:r>
+          </w:p>
+        </w:tc>
+      </w:tr>
+      <w:tr>
+        <w:tc>
+          <w:tcPr>
+            <w:tcW w:type="dxa" w:w="3200"/>
+            <w:shd w:fill="F2F2F2" w:val="clear"/>
+          </w:tcPr>
+          <w:p>
+            <w:r>
+              <w:rPr>
+                <w:b/>
+                <w:bCs/>
+              </w:rPr>
+              <w:t xml:space="preserve">Guidance credibility</w:t>
+            </w:r>
+          </w:p>
+        </w:tc>
+        <w:tc>
+          <w:tcPr>
+            <w:tcW w:type="dxa" w:w="5800"/>
+          </w:tcPr>
+          <w:p>
+            <w:r>
+              <w:t xml:space="preserve">no-track-record</w:t>
+            </w:r>
+          </w:p>
+        </w:tc>
+      </w:tr>
+      <w:tr>
+        <w:tc>
+          <w:tcPr>
+            <w:tcW w:type="dxa" w:w="3200"/>
+            <w:shd w:fill="F2F2F2" w:val="clear"/>
+          </w:tcPr>
+          <w:p>
+            <w:r>
+              <w:rPr>
+                <w:b/>
+                <w:bCs/>
+              </w:rPr>
+              <w:t xml:space="preserve">Shareholder returns</w:t>
+            </w:r>
+          </w:p>
+        </w:tc>
+        <w:tc>
+          <w:tcPr>
+            <w:tcW w:type="dxa" w:w="5800"/>
+          </w:tcPr>
+          <w:p>
+            <w:r>
+              <w:t xml:space="preserve">none</w:t>
+            </w:r>
+          </w:p>
+        </w:tc>
+      </w:tr>
+      <w:tr>
+        <w:tc>
+          <w:tcPr>
+            <w:tcW w:type="dxa" w:w="3200"/>
+            <w:shd w:fill="F2F2F2" w:val="clear"/>
+          </w:tcPr>
+          <w:p>
+            <w:r>
+              <w:rPr>
+                <w:b/>
+                <w:bCs/>
+              </w:rPr>
+              <w:t xml:space="preserve">Capability ladder / VAP</w:t>
+            </w:r>
+          </w:p>
+        </w:tc>
+        <w:tc>
+          <w:tcPr>
+            <w:tcW w:type="dxa" w:w="5800"/>
+          </w:tcPr>
+          <w:p>
+            <w:r>
+              <w:t xml:space="preserve">Stated move from PVC cables to XLPE and Aerial Bunched (AB) cables, and toward value-added/specialised cables and export markets -- explicit value-curve language, but unproven at scale.</w:t>
             </w:r>
           </w:p>
         </w:tc>
@@ -1067,7 +1673,7 @@
     </w:tbl>
     <w:p>
       <w:pPr>
-        <w:spacing w:after="60" w:before="120"/>
+        <w:spacing w:after="120"/>
       </w:pPr>
       <w:r>
         <w:rPr>
@@ -1076,66 +1682,191 @@
           <w:sz w:val="20"/>
           <w:szCs w:val="20"/>
         </w:rPr>
-        <w:t xml:space="preserve">Track record (Coffee Can persistence check): </w:t>
-      </w:r>
-      <w:r>
-        <w:rPr>
-          <w:sz w:val="20"/>
-          <w:szCs w:val="20"/>
-        </w:rPr>
-        <w:t xml:space="preserve">cleared revenue growth ≥10% AND ROCE ≥15% in 4 of the last 4 years (consistency_score 100)</w:t>
-      </w:r>
-    </w:p>
-    <w:p>
-      <w:pPr>
-        <w:spacing w:after="120"/>
-      </w:pPr>
-      <w:r>
-        <w:rPr>
-          <w:color w:val="666666"/>
-          <w:sz w:val="18"/>
-          <w:szCs w:val="18"/>
-        </w:rPr>
-        <w:t xml:space="preserve">Per screener.in (FY23-FY26): revenue growth &gt;14% and ROCE &gt;20% every year -- but this is a tiny-base ramp (revenue Rs 15 Cr FY22 -&gt; Rs 125 Cr FY26) after a 2024 IPO; the high ROCE is a small-base artefact and FY26 operating cash flow was negative Rs 27 Cr on a working-capital build (debtor days ~155). Consistency is unproven.</w:t>
-      </w:r>
-    </w:p>
-    <w:p>
-      <w:pPr>
-        <w:pStyle w:val="Heading1"/>
-        <w:spacing w:after="120" w:before="280"/>
-      </w:pPr>
-      <w:r>
-        <w:t xml:space="preserve">Technical Read (Weekly / Monthly MACD + Bollinger Bands, or RSI/CCI/Williams %R proxy)</w:t>
-      </w:r>
-    </w:p>
-    <w:p>
-      <w:pPr>
-        <w:spacing w:after="120"/>
-      </w:pPr>
-      <w:r>
-        <w:t xml:space="preserve">Not pulled. 2024 IPO (listed ~2% below issue); thin microcap float.</w:t>
-      </w:r>
-    </w:p>
-    <w:p>
-      <w:pPr>
-        <w:pStyle w:val="Heading1"/>
-        <w:spacing w:after="120" w:before="280"/>
-      </w:pPr>
-      <w:r>
-        <w:t xml:space="preserve">ValuePickr Community Signal</w:t>
-      </w:r>
-    </w:p>
-    <w:p>
-      <w:pPr>
-        <w:spacing w:after="120"/>
-      </w:pPr>
-      <w:r>
-        <w:t xml:space="preserve">No ValuePickr thread. Web/filings/news only: Q1 FY27 net sales +226% to Rs 45.3 Cr, the FY23-&gt;FY25 revenue ramp (Rs 18.8 Cr -&gt; Rs 110.7 Cr) and PAT ramp (Rs 0.18 Cr -&gt; Rs 10.8 Cr), promoter holding ~62.8%, and management commentary on capacity, exports, value-added cables and an integrated facility.</w:t>
-      </w:r>
-    </w:p>
-    <w:p>
-      <w:pPr>
-        <w:spacing w:after="120"/>
+        <w:t xml:space="preserve">Quality metrics (ROCE · debt · FCF · margin · capex):</w:t>
+      </w:r>
+    </w:p>
+    <w:tbl>
+      <w:tblPr>
+        <w:tblW w:type="dxa" w:w="9000"/>
+        <w:tblBorders>
+          <w:top w:val="single" w:color="auto" w:sz="4"/>
+          <w:left w:val="single" w:color="auto" w:sz="4"/>
+          <w:bottom w:val="single" w:color="auto" w:sz="4"/>
+          <w:right w:val="single" w:color="auto" w:sz="4"/>
+          <w:insideH w:val="single" w:color="auto" w:sz="4"/>
+          <w:insideV w:val="single" w:color="auto" w:sz="4"/>
+        </w:tblBorders>
+      </w:tblPr>
+      <w:tblGrid>
+        <w:gridCol w:w="3200"/>
+        <w:gridCol w:w="5800"/>
+      </w:tblGrid>
+      <w:tr>
+        <w:tc>
+          <w:tcPr>
+            <w:tcW w:type="dxa" w:w="3200"/>
+            <w:shd w:fill="F2F2F2" w:val="clear"/>
+          </w:tcPr>
+          <w:p>
+            <w:r>
+              <w:rPr>
+                <w:b/>
+                <w:bCs/>
+              </w:rPr>
+              <w:t xml:space="preserve">Assessment</w:t>
+            </w:r>
+          </w:p>
+        </w:tc>
+        <w:tc>
+          <w:tcPr>
+            <w:tcW w:type="dxa" w:w="5800"/>
+          </w:tcPr>
+          <w:p>
+            <w:r>
+              <w:t xml:space="preserve">concern</w:t>
+            </w:r>
+          </w:p>
+        </w:tc>
+      </w:tr>
+      <w:tr>
+        <w:tc>
+          <w:tcPr>
+            <w:tcW w:type="dxa" w:w="3200"/>
+            <w:shd w:fill="F2F2F2" w:val="clear"/>
+          </w:tcPr>
+          <w:p>
+            <w:r>
+              <w:rPr>
+                <w:b/>
+                <w:bCs/>
+              </w:rPr>
+              <w:t xml:space="preserve">ROCE</w:t>
+            </w:r>
+          </w:p>
+        </w:tc>
+        <w:tc>
+          <w:tcPr>
+            <w:tcW w:type="dxa" w:w="5800"/>
+          </w:tcPr>
+          <w:p>
+            <w:r>
+              <w:t xml:space="preserve">23.6% (declining)</w:t>
+            </w:r>
+          </w:p>
+        </w:tc>
+      </w:tr>
+      <w:tr>
+        <w:tc>
+          <w:tcPr>
+            <w:tcW w:type="dxa" w:w="3200"/>
+            <w:shd w:fill="F2F2F2" w:val="clear"/>
+          </w:tcPr>
+          <w:p>
+            <w:r>
+              <w:rPr>
+                <w:b/>
+                <w:bCs/>
+              </w:rPr>
+              <w:t xml:space="preserve">Leverage</w:t>
+            </w:r>
+          </w:p>
+        </w:tc>
+        <w:tc>
+          <w:tcPr>
+            <w:tcW w:type="dxa" w:w="5800"/>
+          </w:tcPr>
+          <w:p>
+            <w:r>
+              <w:t xml:space="preserve">Net debt/EBITDA 0.5x</w:t>
+            </w:r>
+          </w:p>
+        </w:tc>
+      </w:tr>
+      <w:tr>
+        <w:tc>
+          <w:tcPr>
+            <w:tcW w:type="dxa" w:w="3200"/>
+            <w:shd w:fill="F2F2F2" w:val="clear"/>
+          </w:tcPr>
+          <w:p>
+            <w:r>
+              <w:rPr>
+                <w:b/>
+                <w:bCs/>
+              </w:rPr>
+              <w:t xml:space="preserve">FCF conversion</w:t>
+            </w:r>
+          </w:p>
+        </w:tc>
+        <w:tc>
+          <w:tcPr>
+            <w:tcW w:type="dxa" w:w="5800"/>
+          </w:tcPr>
+          <w:p>
+            <w:r>
+              <w:t xml:space="preserve">-180%</w:t>
+            </w:r>
+          </w:p>
+        </w:tc>
+      </w:tr>
+      <w:tr>
+        <w:tc>
+          <w:tcPr>
+            <w:tcW w:type="dxa" w:w="3200"/>
+            <w:shd w:fill="F2F2F2" w:val="clear"/>
+          </w:tcPr>
+          <w:p>
+            <w:r>
+              <w:rPr>
+                <w:b/>
+                <w:bCs/>
+              </w:rPr>
+              <w:t xml:space="preserve">Margin trend</w:t>
+            </w:r>
+          </w:p>
+        </w:tc>
+        <w:tc>
+          <w:tcPr>
+            <w:tcW w:type="dxa" w:w="5800"/>
+          </w:tcPr>
+          <w:p>
+            <w:r>
+              <w:t xml:space="preserve">expanding</w:t>
+            </w:r>
+          </w:p>
+        </w:tc>
+      </w:tr>
+      <w:tr>
+        <w:tc>
+          <w:tcPr>
+            <w:tcW w:type="dxa" w:w="3200"/>
+            <w:shd w:fill="F2F2F2" w:val="clear"/>
+          </w:tcPr>
+          <w:p>
+            <w:r>
+              <w:rPr>
+                <w:b/>
+                <w:bCs/>
+              </w:rPr>
+              <w:t xml:space="preserve">Capex efficiency</w:t>
+            </w:r>
+          </w:p>
+        </w:tc>
+        <w:tc>
+          <w:tcPr>
+            <w:tcW w:type="dxa" w:w="5800"/>
+          </w:tcPr>
+          <w:p>
+            <w:r>
+              <w:t xml:space="preserve">value-destructive</w:t>
+            </w:r>
+          </w:p>
+        </w:tc>
+      </w:tr>
+    </w:tbl>
+    <w:p>
+      <w:pPr>
+        <w:spacing w:after="60" w:before="120"/>
       </w:pPr>
       <w:r>
         <w:rPr>
@@ -1144,14 +1875,27 @@
           <w:sz w:val="20"/>
           <w:szCs w:val="20"/>
         </w:rPr>
-        <w:t xml:space="preserve">High-conviction call from a top contributor: </w:t>
+        <w:t xml:space="preserve">Track record (Coffee Can persistence check): </w:t>
       </w:r>
       <w:r>
         <w:rPr>
           <w:sz w:val="20"/>
           <w:szCs w:val="20"/>
         </w:rPr>
-        <w:t xml:space="preserve">None available - Sovrenn Discovery is the only external flag.</w:t>
+        <w:t xml:space="preserve">cleared revenue growth ≥10% AND ROCE ≥15% in 3 of the last 4 years (consistency_score 75)</w:t>
+      </w:r>
+    </w:p>
+    <w:p>
+      <w:pPr>
+        <w:spacing w:after="120"/>
+      </w:pPr>
+      <w:r>
+        <w:rPr>
+          <w:color w:val="666666"/>
+          <w:sz w:val="18"/>
+          <w:szCs w:val="18"/>
+        </w:rPr>
+        <w:t xml:space="preserve">Per screener.in (FY23-FY26): revenue growth &gt;14% and ROCE &gt;20% held in FY23-FY25, but FY26 breaks the pattern -- PAT was flat-to-down YoY (~Rs10cr vs Rs10.8cr) even as revenue grew, and operating cash flow turned sharply negative (Rs -27cr) on a working-capital blowout (debtor days 72-&gt;155). This is a tiny-base IPO ramp (revenue ~Rs15cr FY22 -&gt; ~Rs121cr FY26); the high historical ROCE is a small-base artefact and FY26 is the first year the pattern has cracked.</w:t>
       </w:r>
     </w:p>
     <w:p>
@@ -1160,15 +1904,558 @@
         <w:spacing w:after="120" w:before="280"/>
       </w:pPr>
       <w:r>
-        <w:t xml:space="preserve">BSE Corporate Actions / Other Red Flags</w:t>
-      </w:r>
-    </w:p>
-    <w:p>
-      <w:pPr>
-        <w:spacing w:after="120"/>
-      </w:pPr>
-      <w:r>
-        <w:t xml:space="preserve">No SEBI or fraud action found. IPO'd 2024. Promoter holding ~62.8%. No disclosed order book; 'integrated cable facility' capex referenced by management but funding not detailed.</w:t>
+        <w:t xml:space="preserve">Fundamentals-Gap Checks (shareholding · working capital · sector KPIs · scenario analysis)</w:t>
+      </w:r>
+    </w:p>
+    <w:p>
+      <w:pPr>
+        <w:spacing w:after="120"/>
+      </w:pPr>
+      <w:r>
+        <w:rPr>
+          <w:i/>
+          <w:iCs/>
+          <w:color w:val="666666"/>
+          <w:sz w:val="18"/>
+          <w:szCs w:val="18"/>
+        </w:rPr>
+        <w:t xml:space="preserve">Extra fundamentals extracted from the same filings — informational only, not yet consumed by any scoring script.</w:t>
+      </w:r>
+    </w:p>
+    <w:p>
+      <w:pPr>
+        <w:spacing w:after="120"/>
+      </w:pPr>
+      <w:r>
+        <w:rPr>
+          <w:b/>
+          <w:bCs/>
+          <w:sz w:val="20"/>
+          <w:szCs w:val="20"/>
+        </w:rPr>
+        <w:t xml:space="preserve">Shareholding pattern:</w:t>
+      </w:r>
+    </w:p>
+    <w:tbl>
+      <w:tblPr>
+        <w:tblW w:type="dxa" w:w="9000"/>
+        <w:tblBorders>
+          <w:top w:val="single" w:color="auto" w:sz="4"/>
+          <w:left w:val="single" w:color="auto" w:sz="4"/>
+          <w:bottom w:val="single" w:color="auto" w:sz="4"/>
+          <w:right w:val="single" w:color="auto" w:sz="4"/>
+          <w:insideH w:val="single" w:color="auto" w:sz="4"/>
+          <w:insideV w:val="single" w:color="auto" w:sz="4"/>
+        </w:tblBorders>
+      </w:tblPr>
+      <w:tblGrid>
+        <w:gridCol w:w="3200"/>
+        <w:gridCol w:w="5800"/>
+      </w:tblGrid>
+      <w:tr>
+        <w:tc>
+          <w:tcPr>
+            <w:tcW w:type="dxa" w:w="3200"/>
+            <w:shd w:fill="F2F2F2" w:val="clear"/>
+          </w:tcPr>
+          <w:p>
+            <w:r>
+              <w:rPr>
+                <w:b/>
+                <w:bCs/>
+              </w:rPr>
+              <w:t xml:space="preserve">Promoter %</w:t>
+            </w:r>
+          </w:p>
+        </w:tc>
+        <w:tc>
+          <w:tcPr>
+            <w:tcW w:type="dxa" w:w="5800"/>
+          </w:tcPr>
+          <w:p>
+            <w:r>
+              <w:t xml:space="preserve">65.59% (rising)</w:t>
+            </w:r>
+          </w:p>
+        </w:tc>
+      </w:tr>
+      <w:tr>
+        <w:tc>
+          <w:tcPr>
+            <w:tcW w:type="dxa" w:w="3200"/>
+            <w:shd w:fill="F2F2F2" w:val="clear"/>
+          </w:tcPr>
+          <w:p>
+            <w:r>
+              <w:rPr>
+                <w:b/>
+                <w:bCs/>
+              </w:rPr>
+              <w:t xml:space="preserve">Pledge %</w:t>
+            </w:r>
+          </w:p>
+        </w:tc>
+        <w:tc>
+          <w:tcPr>
+            <w:tcW w:type="dxa" w:w="5800"/>
+          </w:tcPr>
+          <w:p>
+            <w:r>
+              <w:t xml:space="preserve">0% (stable)</w:t>
+            </w:r>
+          </w:p>
+        </w:tc>
+      </w:tr>
+      <w:tr>
+        <w:tc>
+          <w:tcPr>
+            <w:tcW w:type="dxa" w:w="3200"/>
+            <w:shd w:fill="F2F2F2" w:val="clear"/>
+          </w:tcPr>
+          <w:p>
+            <w:r>
+              <w:rPr>
+                <w:b/>
+                <w:bCs/>
+              </w:rPr>
+              <w:t xml:space="preserve">FII/DII %</w:t>
+            </w:r>
+          </w:p>
+        </w:tc>
+        <w:tc>
+          <w:tcPr>
+            <w:tcW w:type="dxa" w:w="5800"/>
+          </w:tcPr>
+          <w:p>
+            <w:r>
+              <w:t xml:space="preserve">11.74% (falling)</w:t>
+            </w:r>
+          </w:p>
+        </w:tc>
+      </w:tr>
+      <w:tr>
+        <w:tc>
+          <w:tcPr>
+            <w:tcW w:type="dxa" w:w="3200"/>
+            <w:shd w:fill="F2F2F2" w:val="clear"/>
+          </w:tcPr>
+          <w:p>
+            <w:r>
+              <w:rPr>
+                <w:b/>
+                <w:bCs/>
+              </w:rPr>
+              <w:t xml:space="preserve">Quarters checked</w:t>
+            </w:r>
+          </w:p>
+        </w:tc>
+        <w:tc>
+          <w:tcPr>
+            <w:tcW w:type="dxa" w:w="5800"/>
+          </w:tcPr>
+          <w:p>
+            <w:r>
+              <w:t xml:space="preserve">Sep-2025, Dec-2025, Mar-2026, Jun-2026</w:t>
+            </w:r>
+          </w:p>
+        </w:tc>
+      </w:tr>
+    </w:tbl>
+    <w:p>
+      <w:pPr>
+        <w:spacing w:after="120"/>
+      </w:pPr>
+      <w:r>
+        <w:rPr>
+          <w:color w:val="666666"/>
+          <w:sz w:val="18"/>
+          <w:szCs w:val="18"/>
+        </w:rPr>
+        <w:t xml:space="preserve">Promoter holding rose from 62.75% (Sep/Dec-2025) to 65.59% (Mar/Jun-2026) -- rising, not falling, so no promoter-exit signal despite the cash-flow concerns found elsewhere. FII holding has been declining (3.14%-&gt;1.48%) over the same window while DII has stayed roughly flat (~10.3-10.6%).</w:t>
+      </w:r>
+    </w:p>
+    <w:p>
+      <w:pPr>
+        <w:spacing w:after="120"/>
+      </w:pPr>
+      <w:r>
+        <w:rPr>
+          <w:b/>
+          <w:bCs/>
+          <w:sz w:val="20"/>
+          <w:szCs w:val="20"/>
+        </w:rPr>
+        <w:t xml:space="preserve">Working capital:</w:t>
+      </w:r>
+    </w:p>
+    <w:tbl>
+      <w:tblPr>
+        <w:tblW w:type="dxa" w:w="9000"/>
+        <w:tblBorders>
+          <w:top w:val="single" w:color="auto" w:sz="4"/>
+          <w:left w:val="single" w:color="auto" w:sz="4"/>
+          <w:bottom w:val="single" w:color="auto" w:sz="4"/>
+          <w:right w:val="single" w:color="auto" w:sz="4"/>
+          <w:insideH w:val="single" w:color="auto" w:sz="4"/>
+          <w:insideV w:val="single" w:color="auto" w:sz="4"/>
+        </w:tblBorders>
+      </w:tblPr>
+      <w:tblGrid>
+        <w:gridCol w:w="3200"/>
+        <w:gridCol w:w="5800"/>
+      </w:tblGrid>
+      <w:tr>
+        <w:tc>
+          <w:tcPr>
+            <w:tcW w:type="dxa" w:w="3200"/>
+            <w:shd w:fill="F2F2F2" w:val="clear"/>
+          </w:tcPr>
+          <w:p>
+            <w:r>
+              <w:rPr>
+                <w:b/>
+                <w:bCs/>
+              </w:rPr>
+              <w:t xml:space="preserve">Inventory days</w:t>
+            </w:r>
+          </w:p>
+        </w:tc>
+        <w:tc>
+          <w:tcPr>
+            <w:tcW w:type="dxa" w:w="5800"/>
+          </w:tcPr>
+          <w:p>
+            <w:r>
+              <w:t xml:space="preserve">—</w:t>
+            </w:r>
+          </w:p>
+        </w:tc>
+      </w:tr>
+      <w:tr>
+        <w:tc>
+          <w:tcPr>
+            <w:tcW w:type="dxa" w:w="3200"/>
+            <w:shd w:fill="F2F2F2" w:val="clear"/>
+          </w:tcPr>
+          <w:p>
+            <w:r>
+              <w:rPr>
+                <w:b/>
+                <w:bCs/>
+              </w:rPr>
+              <w:t xml:space="preserve">Receivable days</w:t>
+            </w:r>
+          </w:p>
+        </w:tc>
+        <w:tc>
+          <w:tcPr>
+            <w:tcW w:type="dxa" w:w="5800"/>
+          </w:tcPr>
+          <w:p>
+            <w:r>
+              <w:t xml:space="preserve">155</w:t>
+            </w:r>
+          </w:p>
+        </w:tc>
+      </w:tr>
+      <w:tr>
+        <w:tc>
+          <w:tcPr>
+            <w:tcW w:type="dxa" w:w="3200"/>
+            <w:shd w:fill="F2F2F2" w:val="clear"/>
+          </w:tcPr>
+          <w:p>
+            <w:r>
+              <w:rPr>
+                <w:b/>
+                <w:bCs/>
+              </w:rPr>
+              <w:t xml:space="preserve">Payable days</w:t>
+            </w:r>
+          </w:p>
+        </w:tc>
+        <w:tc>
+          <w:tcPr>
+            <w:tcW w:type="dxa" w:w="5800"/>
+          </w:tcPr>
+          <w:p>
+            <w:r>
+              <w:t xml:space="preserve">—</w:t>
+            </w:r>
+          </w:p>
+        </w:tc>
+      </w:tr>
+      <w:tr>
+        <w:tc>
+          <w:tcPr>
+            <w:tcW w:type="dxa" w:w="3200"/>
+            <w:shd w:fill="F2F2F2" w:val="clear"/>
+          </w:tcPr>
+          <w:p>
+            <w:r>
+              <w:rPr>
+                <w:b/>
+                <w:bCs/>
+              </w:rPr>
+              <w:t xml:space="preserve">Cash conversion cycle</w:t>
+            </w:r>
+          </w:p>
+        </w:tc>
+        <w:tc>
+          <w:tcPr>
+            <w:tcW w:type="dxa" w:w="5800"/>
+          </w:tcPr>
+          <w:p>
+            <w:r>
+              <w:t xml:space="preserve">150</w:t>
+            </w:r>
+          </w:p>
+        </w:tc>
+      </w:tr>
+      <w:tr>
+        <w:tc>
+          <w:tcPr>
+            <w:tcW w:type="dxa" w:w="3200"/>
+            <w:shd w:fill="F2F2F2" w:val="clear"/>
+          </w:tcPr>
+          <w:p>
+            <w:r>
+              <w:rPr>
+                <w:b/>
+                <w:bCs/>
+              </w:rPr>
+              <w:t xml:space="preserve">3y trend</w:t>
+            </w:r>
+          </w:p>
+        </w:tc>
+        <w:tc>
+          <w:tcPr>
+            <w:tcW w:type="dxa" w:w="5800"/>
+          </w:tcPr>
+          <w:p>
+            <w:r>
+              <w:t xml:space="preserve">elongating</w:t>
+            </w:r>
+          </w:p>
+        </w:tc>
+      </w:tr>
+      <w:tr>
+        <w:tc>
+          <w:tcPr>
+            <w:tcW w:type="dxa" w:w="3200"/>
+            <w:shd w:fill="F2F2F2" w:val="clear"/>
+          </w:tcPr>
+          <w:p>
+            <w:r>
+              <w:rPr>
+                <w:b/>
+                <w:bCs/>
+              </w:rPr>
+              <w:t xml:space="preserve">Vs sector</w:t>
+            </w:r>
+          </w:p>
+        </w:tc>
+        <w:tc>
+          <w:tcPr>
+            <w:tcW w:type="dxa" w:w="5800"/>
+          </w:tcPr>
+          <w:p>
+            <w:r>
+              <w:t xml:space="preserve">looser-than-sector</w:t>
+            </w:r>
+          </w:p>
+        </w:tc>
+      </w:tr>
+    </w:tbl>
+    <w:p>
+      <w:pPr>
+        <w:spacing w:after="120"/>
+      </w:pPr>
+      <w:r>
+        <w:rPr>
+          <w:color w:val="666666"/>
+          <w:sz w:val="18"/>
+          <w:szCs w:val="18"/>
+        </w:rPr>
+        <w:t xml:space="preserve">Debtor days jumped from 55 (FY24) to 72 (FY25) to ~155 (FY26), and overall working-capital days from 33 to 36 to ~150 -- a sharp one-year deterioration against a segment (LV cables to discoms/government buyers) that is already known for slow government-linked receivables, making Bhadora's swing look worse than the sector's already-elevated norm.</w:t>
+      </w:r>
+    </w:p>
+    <w:p>
+      <w:pPr>
+        <w:spacing w:after="120"/>
+      </w:pPr>
+      <w:r>
+        <w:rPr>
+          <w:b/>
+          <w:bCs/>
+          <w:sz w:val="20"/>
+          <w:szCs w:val="20"/>
+        </w:rPr>
+        <w:t xml:space="preserve">Sector KPIs:</w:t>
+      </w:r>
+    </w:p>
+    <w:p>
+      <w:pPr>
+        <w:pStyle w:val="ListParagraph"/>
+        <w:numPr>
+          <w:ilvl w:val="0"/>
+          <w:numId w:val="1"/>
+        </w:numPr>
+        <w:spacing w:after="60"/>
+      </w:pPr>
+      <w:r>
+        <w:t xml:space="preserve">Net sales growth (Q1 FY27): +226% YoY to Rs45.3cr, attributed to mix + realisations (improving) — not confirmed as volume-led; no order-book disclosure to corroborate durability</w:t>
+      </w:r>
+    </w:p>
+    <w:p>
+      <w:pPr>
+        <w:pStyle w:val="ListParagraph"/>
+        <w:numPr>
+          <w:ilvl w:val="0"/>
+          <w:numId w:val="1"/>
+        </w:numPr>
+        <w:spacing w:after="60"/>
+      </w:pPr>
+      <w:r>
+        <w:t xml:space="preserve">Debtor days: ~155 (FY26) vs 72 (FY25) vs 55 (FY24) (declining) — sharp one-year deterioration</w:t>
+      </w:r>
+    </w:p>
+    <w:p>
+      <w:pPr>
+        <w:pStyle w:val="ListParagraph"/>
+        <w:numPr>
+          <w:ilvl w:val="0"/>
+          <w:numId w:val="1"/>
+        </w:numPr>
+        <w:spacing w:after="60"/>
+      </w:pPr>
+      <w:r>
+        <w:t xml:space="preserve">Operating cash flow: Rs -27cr (FY26) vs Rs10cr PAT (declining) — cash conversion has broken down even as the P&amp;L shows growth</w:t>
+      </w:r>
+    </w:p>
+    <w:p>
+      <w:pPr>
+        <w:spacing w:after="120"/>
+      </w:pPr>
+      <w:r>
+        <w:rPr>
+          <w:b/>
+          <w:bCs/>
+          <w:sz w:val="20"/>
+          <w:szCs w:val="20"/>
+        </w:rPr>
+        <w:t xml:space="preserve">Scenario analysis (closest to: bull):</w:t>
+      </w:r>
+    </w:p>
+    <w:tbl>
+      <w:tblPr>
+        <w:tblW w:type="dxa" w:w="9000"/>
+        <w:tblBorders>
+          <w:top w:val="single" w:color="auto" w:sz="4"/>
+          <w:left w:val="single" w:color="auto" w:sz="4"/>
+          <w:bottom w:val="single" w:color="auto" w:sz="4"/>
+          <w:right w:val="single" w:color="auto" w:sz="4"/>
+          <w:insideH w:val="single" w:color="auto" w:sz="4"/>
+          <w:insideV w:val="single" w:color="auto" w:sz="4"/>
+        </w:tblBorders>
+      </w:tblPr>
+      <w:tblGrid>
+        <w:gridCol w:w="3200"/>
+        <w:gridCol w:w="5800"/>
+      </w:tblGrid>
+      <w:tr>
+        <w:tc>
+          <w:tcPr>
+            <w:tcW w:type="dxa" w:w="3200"/>
+            <w:shd w:fill="F2F2F2" w:val="clear"/>
+          </w:tcPr>
+          <w:p>
+            <w:r>
+              <w:rPr>
+                <w:b/>
+                <w:bCs/>
+              </w:rPr>
+              <w:t xml:space="preserve">Bull</w:t>
+            </w:r>
+          </w:p>
+        </w:tc>
+        <w:tc>
+          <w:tcPr>
+            <w:tcW w:type="dxa" w:w="5800"/>
+          </w:tcPr>
+          <w:p>
+            <w:r>
+              <w:t xml:space="preserve">rev CAGR 45%, FY28 margin 12%, FY28 EPS 12, exit 18x, implied price 216 (+83% vs CMP)</w:t>
+            </w:r>
+          </w:p>
+        </w:tc>
+      </w:tr>
+      <w:tr>
+        <w:tc>
+          <w:tcPr>
+            <w:tcW w:type="dxa" w:w="3200"/>
+            <w:shd w:fill="F2F2F2" w:val="clear"/>
+          </w:tcPr>
+          <w:p>
+            <w:r>
+              <w:rPr>
+                <w:b/>
+                <w:bCs/>
+              </w:rPr>
+              <w:t xml:space="preserve">Base</w:t>
+            </w:r>
+          </w:p>
+        </w:tc>
+        <w:tc>
+          <w:tcPr>
+            <w:tcW w:type="dxa" w:w="5800"/>
+          </w:tcPr>
+          <w:p>
+            <w:r>
+              <w:t xml:space="preserve">rev CAGR 20%, FY28 margin 9%, FY28 EPS 8.5, exit 14x, implied price 119 (+1% vs CMP)</w:t>
+            </w:r>
+          </w:p>
+        </w:tc>
+      </w:tr>
+      <w:tr>
+        <w:tc>
+          <w:tcPr>
+            <w:tcW w:type="dxa" w:w="3200"/>
+            <w:shd w:fill="F2F2F2" w:val="clear"/>
+          </w:tcPr>
+          <w:p>
+            <w:r>
+              <w:rPr>
+                <w:b/>
+                <w:bCs/>
+              </w:rPr>
+              <w:t xml:space="preserve">Bear</w:t>
+            </w:r>
+          </w:p>
+        </w:tc>
+        <w:tc>
+          <w:tcPr>
+            <w:tcW w:type="dxa" w:w="5800"/>
+          </w:tcPr>
+          <w:p>
+            <w:r>
+              <w:t xml:space="preserve">rev CAGR 5%, FY28 margin 6%, FY28 EPS 4.5, exit 10x, implied price 45 (-62% vs CMP)</w:t>
+            </w:r>
+          </w:p>
+        </w:tc>
+      </w:tr>
+    </w:tbl>
+    <w:p>
+      <w:pPr>
+        <w:spacing w:after="120"/>
+      </w:pPr>
+      <w:r>
+        <w:rPr>
+          <w:color w:val="666666"/>
+          <w:sz w:val="18"/>
+          <w:szCs w:val="18"/>
+        </w:rPr>
+        <w:t xml:space="preserve">Today's ~22x P/E already sits above the base case's ~14x fair multiple on modest growth, i.e. the price needs something closer to the bull case (order-backed volume growth holding at 40%+ with margins staying near current levels) to be justified -- consistent with the 'over-optimistic' gap_direction. Bear case assumes the +226% quarter proves to be a one-off realisation spike that normalises alongside the FY26 cash-conversion problem.</w:t>
       </w:r>
     </w:p>
     <w:p>
@@ -1177,59 +2464,15 @@
         <w:spacing w:after="120" w:before="280"/>
       </w:pPr>
       <w:r>
-        <w:t xml:space="preserve">Bull Case</w:t>
-      </w:r>
-    </w:p>
-    <w:p>
-      <w:pPr>
-        <w:pStyle w:val="ListParagraph"/>
-        <w:numPr>
-          <w:ilvl w:val="0"/>
-          <w:numId w:val="1"/>
-        </w:numPr>
-        <w:spacing w:after="60"/>
-      </w:pPr>
-      <w:r>
-        <w:t xml:space="preserve">Revenue ~6x from FY23 to FY25; Q1 FY27 net sales +226% YoY; reported ROE ~51% / ROCE ~42%</w:t>
-      </w:r>
-    </w:p>
-    <w:p>
-      <w:pPr>
-        <w:pStyle w:val="ListParagraph"/>
-        <w:numPr>
-          <w:ilvl w:val="0"/>
-          <w:numId w:val="1"/>
-        </w:numPr>
-        <w:spacing w:after="60"/>
-      </w:pPr>
-      <w:r>
-        <w:t xml:space="preserve">LV / XLPE / AB cables into discom + infra T&amp;D capex - overlaps the priority-1 grid-transmission / copper-electrification themes</w:t>
-      </w:r>
-    </w:p>
-    <w:p>
-      <w:pPr>
-        <w:pStyle w:val="ListParagraph"/>
-        <w:numPr>
-          <w:ilvl w:val="0"/>
-          <w:numId w:val="1"/>
-        </w:numPr>
-        <w:spacing w:after="60"/>
-      </w:pPr>
-      <w:r>
-        <w:t xml:space="preserve">Move up-mix toward value-added / specialised cables and into institutional + export markets</w:t>
-      </w:r>
-    </w:p>
-    <w:p>
-      <w:pPr>
-        <w:pStyle w:val="ListParagraph"/>
-        <w:numPr>
-          <w:ilvl w:val="0"/>
-          <w:numId w:val="1"/>
-        </w:numPr>
-        <w:spacing w:after="60"/>
-      </w:pPr>
-      <w:r>
-        <w:t xml:space="preserve">Very small base (~Rs 126 Cr mcap) - large percentage moves possible if the ramp holds and the integrated facility executes</w:t>
+        <w:t xml:space="preserve">Technical Read (Weekly / Monthly MACD + Bollinger Bands, or RSI/CCI/Williams %R proxy)</w:t>
+      </w:r>
+    </w:p>
+    <w:p>
+      <w:pPr>
+        <w:spacing w:after="120"/>
+      </w:pPr>
+      <w:r>
+        <w:t xml:space="preserve">Not pulled. 2024 IPO (listed ~2% below issue); thin microcap float.</w:t>
       </w:r>
     </w:p>
     <w:p>
@@ -1238,72 +2481,36 @@
         <w:spacing w:after="120" w:before="280"/>
       </w:pPr>
       <w:r>
-        <w:t xml:space="preserve">Bear Case / Key Risks</w:t>
-      </w:r>
-    </w:p>
-    <w:p>
-      <w:pPr>
-        <w:pStyle w:val="ListParagraph"/>
-        <w:numPr>
-          <w:ilvl w:val="0"/>
-          <w:numId w:val="1"/>
-        </w:numPr>
-        <w:spacing w:after="60"/>
-      </w:pPr>
-      <w:r>
-        <w:t xml:space="preserve">Tiny base - reported ROE/ROCE are a small-number artefact, not evidence of a moat</w:t>
-      </w:r>
-    </w:p>
-    <w:p>
-      <w:pPr>
-        <w:pStyle w:val="ListParagraph"/>
-        <w:numPr>
-          <w:ilvl w:val="0"/>
-          <w:numId w:val="1"/>
-        </w:numPr>
-        <w:spacing w:after="60"/>
-      </w:pPr>
-      <w:r>
-        <w:t xml:space="preserve">+226% quarter credited to 'mix and realisations' (copper-cost pass-through), not confirmed order-backed volume - reversible</w:t>
-      </w:r>
-    </w:p>
-    <w:p>
-      <w:pPr>
-        <w:pStyle w:val="ListParagraph"/>
-        <w:numPr>
-          <w:ilvl w:val="0"/>
-          <w:numId w:val="1"/>
-        </w:numPr>
-        <w:spacing w:after="60"/>
-      </w:pPr>
-      <w:r>
-        <w:t xml:space="preserve">Debt-to-equity already ~0.9 and rising; 'integrated facility' capex funding unclear</w:t>
-      </w:r>
-    </w:p>
-    <w:p>
-      <w:pPr>
-        <w:pStyle w:val="ListParagraph"/>
-        <w:numPr>
-          <w:ilvl w:val="0"/>
-          <w:numId w:val="1"/>
-        </w:numPr>
-        <w:spacing w:after="60"/>
-      </w:pPr>
-      <w:r>
-        <w:t xml:space="preserve">Commoditised LV-cable segment against far larger players (Polycab, KEI, RR Kabel, Cords Cable, Ultracab)</w:t>
-      </w:r>
-    </w:p>
-    <w:p>
-      <w:pPr>
-        <w:pStyle w:val="ListParagraph"/>
-        <w:numPr>
-          <w:ilvl w:val="0"/>
-          <w:numId w:val="1"/>
-        </w:numPr>
-        <w:spacing w:after="60"/>
-      </w:pPr>
-      <w:r>
-        <w:t xml:space="preserve">Microcap SME liquidity; IPO only 2024; no order book, no forum/analyst scrutiny</w:t>
+        <w:t xml:space="preserve">ValuePickr Community Signal</w:t>
+      </w:r>
+    </w:p>
+    <w:p>
+      <w:pPr>
+        <w:spacing w:after="120"/>
+      </w:pPr>
+      <w:r>
+        <w:t xml:space="preserve">No ValuePickr thread. Web/filings/news only: Q1 FY27 net sales +226% to Rs 45.3 Cr, the FY23-&gt;FY25 revenue ramp (Rs 18.8 Cr -&gt; Rs 110.7 Cr) and PAT ramp (Rs 0.18 Cr -&gt; Rs 10.8 Cr), promoter holding ~62.8%, and management commentary on capacity, exports, value-added cables and an integrated facility.</w:t>
+      </w:r>
+    </w:p>
+    <w:p>
+      <w:pPr>
+        <w:spacing w:after="120"/>
+      </w:pPr>
+      <w:r>
+        <w:rPr>
+          <w:b/>
+          <w:bCs/>
+          <w:sz w:val="20"/>
+          <w:szCs w:val="20"/>
+        </w:rPr>
+        <w:t xml:space="preserve">High-conviction call from a top contributor: </w:t>
+      </w:r>
+      <w:r>
+        <w:rPr>
+          <w:sz w:val="20"/>
+          <w:szCs w:val="20"/>
+        </w:rPr>
+        <w:t xml:space="preserve">None available - Sovrenn Discovery is the only external flag.</w:t>
       </w:r>
     </w:p>
     <w:p>
@@ -1312,6 +2519,171 @@
         <w:spacing w:after="120" w:before="280"/>
       </w:pPr>
       <w:r>
+        <w:t xml:space="preserve">BSE Corporate Actions / Other Red Flags</w:t>
+      </w:r>
+    </w:p>
+    <w:p>
+      <w:pPr>
+        <w:spacing w:after="120"/>
+      </w:pPr>
+      <w:r>
+        <w:t xml:space="preserve">No SEBI or fraud action found. IPO'd 2024. Promoter holding ~62.8%. No disclosed order book; 'integrated cable facility' capex referenced by management but funding not detailed.</w:t>
+      </w:r>
+    </w:p>
+    <w:p>
+      <w:pPr>
+        <w:pStyle w:val="Heading1"/>
+        <w:spacing w:after="120" w:before="280"/>
+      </w:pPr>
+      <w:r>
+        <w:t xml:space="preserve">Bull Case</w:t>
+      </w:r>
+    </w:p>
+    <w:p>
+      <w:pPr>
+        <w:pStyle w:val="ListParagraph"/>
+        <w:numPr>
+          <w:ilvl w:val="0"/>
+          <w:numId w:val="1"/>
+        </w:numPr>
+        <w:spacing w:after="60"/>
+      </w:pPr>
+      <w:r>
+        <w:t xml:space="preserve">Revenue ~6x from FY23 to FY25; Q1 FY27 net sales +226% YoY; ROE ~19.3% (3yr avg ~34.4%) / ROCE ~23.6%</w:t>
+      </w:r>
+    </w:p>
+    <w:p>
+      <w:pPr>
+        <w:pStyle w:val="ListParagraph"/>
+        <w:numPr>
+          <w:ilvl w:val="0"/>
+          <w:numId w:val="1"/>
+        </w:numPr>
+        <w:spacing w:after="60"/>
+      </w:pPr>
+      <w:r>
+        <w:t xml:space="preserve">LV / XLPE / AB cables into discom + infra T&amp;D capex - overlaps the priority-1 grid-transmission / copper-electrification themes</w:t>
+      </w:r>
+    </w:p>
+    <w:p>
+      <w:pPr>
+        <w:pStyle w:val="ListParagraph"/>
+        <w:numPr>
+          <w:ilvl w:val="0"/>
+          <w:numId w:val="1"/>
+        </w:numPr>
+        <w:spacing w:after="60"/>
+      </w:pPr>
+      <w:r>
+        <w:t xml:space="preserve">Promoter holding has risen (62.75% -&gt; 65.59% since Sep-2025), not fallen -- no promoter-exit signal; debt-to-equity is genuinely low (~0.29, corrected from a prior ~0.9 estimate)</w:t>
+      </w:r>
+    </w:p>
+    <w:p>
+      <w:pPr>
+        <w:pStyle w:val="ListParagraph"/>
+        <w:numPr>
+          <w:ilvl w:val="0"/>
+          <w:numId w:val="1"/>
+        </w:numPr>
+        <w:spacing w:after="60"/>
+      </w:pPr>
+      <w:r>
+        <w:t xml:space="preserve">New integrated manufacturing facility at Khargone is partially IPO-funded (Rs55.62cr raised Aug-2025), reducing (not eliminating) the funding-gap concern</w:t>
+      </w:r>
+    </w:p>
+    <w:p>
+      <w:pPr>
+        <w:pStyle w:val="ListParagraph"/>
+        <w:numPr>
+          <w:ilvl w:val="0"/>
+          <w:numId w:val="1"/>
+        </w:numPr>
+        <w:spacing w:after="60"/>
+      </w:pPr>
+      <w:r>
+        <w:t xml:space="preserve">Very small base (~Rs 219 Cr mcap) - large percentage moves possible if the ramp holds and the integrated facility executes</w:t>
+      </w:r>
+    </w:p>
+    <w:p>
+      <w:pPr>
+        <w:pStyle w:val="Heading1"/>
+        <w:spacing w:after="120" w:before="280"/>
+      </w:pPr>
+      <w:r>
+        <w:t xml:space="preserve">Bear Case / Key Risks</w:t>
+      </w:r>
+    </w:p>
+    <w:p>
+      <w:pPr>
+        <w:pStyle w:val="ListParagraph"/>
+        <w:numPr>
+          <w:ilvl w:val="0"/>
+          <w:numId w:val="1"/>
+        </w:numPr>
+        <w:spacing w:after="60"/>
+      </w:pPr>
+      <w:r>
+        <w:t xml:space="preserve">FY26 operating cash flow was Rs -27cr against Rs10cr PAT -- a severe cash-conversion problem, with debtor days jumping from 72 to ~155 and working-capital days from 36 to ~150 in one year</w:t>
+      </w:r>
+    </w:p>
+    <w:p>
+      <w:pPr>
+        <w:pStyle w:val="ListParagraph"/>
+        <w:numPr>
+          <w:ilvl w:val="0"/>
+          <w:numId w:val="1"/>
+        </w:numPr>
+        <w:spacing w:after="60"/>
+      </w:pPr>
+      <w:r>
+        <w:t xml:space="preserve">FY26 PAT was essentially flat-to-down YoY (~Rs10cr vs Rs10.8cr FY25) even as revenue grew -- margin/quality of earnings deteriorated despite the top-line story</w:t>
+      </w:r>
+    </w:p>
+    <w:p>
+      <w:pPr>
+        <w:pStyle w:val="ListParagraph"/>
+        <w:numPr>
+          <w:ilvl w:val="0"/>
+          <w:numId w:val="1"/>
+        </w:numPr>
+        <w:spacing w:after="60"/>
+      </w:pPr>
+      <w:r>
+        <w:t xml:space="preserve">+226% quarter credited to 'mix and realisations' (copper-cost pass-through), not confirmed order-backed volume - reversible</w:t>
+      </w:r>
+    </w:p>
+    <w:p>
+      <w:pPr>
+        <w:pStyle w:val="ListParagraph"/>
+        <w:numPr>
+          <w:ilvl w:val="0"/>
+          <w:numId w:val="1"/>
+        </w:numPr>
+        <w:spacing w:after="60"/>
+      </w:pPr>
+      <w:r>
+        <w:t xml:space="preserve">Commoditised LV-cable segment against far larger, better-capitalised players (Polycab, KEI, RR Kabel, Cords Cable, Ultracab)</w:t>
+      </w:r>
+    </w:p>
+    <w:p>
+      <w:pPr>
+        <w:pStyle w:val="ListParagraph"/>
+        <w:numPr>
+          <w:ilvl w:val="0"/>
+          <w:numId w:val="1"/>
+        </w:numPr>
+        <w:spacing w:after="60"/>
+      </w:pPr>
+      <w:r>
+        <w:t xml:space="preserve">Microcap SME liquidity; IPO only Aug-2025; no disclosed order book, no forum/analyst scrutiny; reported ROE/ROCE are still a small-base artefact given the tiny revenue base</w:t>
+      </w:r>
+    </w:p>
+    <w:p>
+      <w:pPr>
+        <w:pStyle w:val="Heading1"/>
+        <w:spacing w:after="120" w:before="280"/>
+      </w:pPr>
+      <w:r>
         <w:t xml:space="preserve">Market-Cap Tier (informational — not a gate in this project)</w:t>
       </w:r>
     </w:p>
@@ -1324,7 +2696,7 @@
           <w:b/>
           <w:bCs/>
         </w:rPr>
-        <w:t xml:space="preserve">Micro-cap (~Rs 126 Cr)</w:t>
+        <w:t xml:space="preserve">Micro-cap (~Rs 219 Cr)</w:t>
       </w:r>
     </w:p>
     <w:p>
@@ -1375,7 +2747,7 @@
           <w:sz w:val="20"/>
           <w:szCs w:val="20"/>
         </w:rPr>
-        <w:t xml:space="preserve">Discom/grid T&amp;D capex + electrification-metals demand is a real sector tailwind; +226% quarter is realisation/mix-led not confirmed volume growth, and reported ROE/ROCE are 'a small-number artefact' — tam weak; explicitly commoditised LV-cable segment vs much larger players (Polycab, KEI, RR Kabel) — moat no; no valuation data, D/E~0.9 already rising with unfunded capex plan — weak.</w:t>
+        <w:t xml:space="preserve">Discom/grid T&amp;D capex + electrification-metals demand is a real sector tailwind; +226% quarter is realisation/mix-led not confirmed volume growth, FY26 PAT was flat-to-down YoY and operating cash flow went to Rs-27cr -- tam weak; explicitly commoditised LV-cable segment vs much larger players (Polycab, KEI, RR Kabel) -- moat no; ~22x P/E already prices continued fast growth against a genuinely deteriorating cash-conversion picture -- valuation weak.</w:t>
       </w:r>
     </w:p>
     <w:p>
@@ -1398,72 +2770,85 @@
           <w:sz w:val="24"/>
           <w:szCs w:val="24"/>
         </w:rPr>
-        <w:t xml:space="preserve">Microcap LV-cable maker with a real revenue spike (6x FY23-&gt;FY25, Q1 FY27 +226%) in the electrification/grid theme, but off a tiny base, on 'mix/realisation' gains, with D/E ~0.9 and no order book - thesis_fit 10x-in-2-3-years (UNCONFIRMED), conviction Low-Medium leaning cautious.</w:t>
-      </w:r>
-    </w:p>
-    <w:p>
-      <w:pPr>
-        <w:pStyle w:val="ListParagraph"/>
-        <w:numPr>
-          <w:ilvl w:val="0"/>
-          <w:numId w:val="1"/>
-        </w:numPr>
-        <w:spacing w:after="60"/>
-      </w:pPr>
-      <w:r>
-        <w:t xml:space="preserve">Sovrenn Discovery seed; the trigger (Q1 FY27 net sales +226% to Rs 45.3 Cr) is confirmed against the filing/press note, but management attributes it to mix + realisations rather than volume, so the datapoint is a lead, not proof</w:t>
-      </w:r>
-    </w:p>
-    <w:p>
-      <w:pPr>
-        <w:pStyle w:val="ListParagraph"/>
-        <w:numPr>
-          <w:ilvl w:val="0"/>
-          <w:numId w:val="1"/>
-        </w:numPr>
-        <w:spacing w:after="60"/>
-      </w:pPr>
-      <w:r>
-        <w:t xml:space="preserve">Trailing-vs-inflection rule applied: weak multi-year history (Rs 18.8 Cr FY23) + a strong specific recent quarter + a live sector catalyst (discom / grid T&amp;D capex, an integrated-facility plan) + microcap -&gt; thesis_fit 10x-in-2-3-years, marked UNCONFIRMED</w:t>
-      </w:r>
-    </w:p>
-    <w:p>
-      <w:pPr>
-        <w:pStyle w:val="ListParagraph"/>
-        <w:numPr>
-          <w:ilvl w:val="0"/>
-          <w:numId w:val="1"/>
-        </w:numPr>
-        <w:spacing w:after="60"/>
-      </w:pPr>
-      <w:r>
-        <w:t xml:space="preserve">UNCONFIRMED and conviction only Low-Medium (leaning cautious): the +226% may be realisation-led and reversible, D/E is already ~0.9, the capex is unfunded on disclosure, the product is commoditised against much larger players, and there is zero independent scrutiny</w:t>
-      </w:r>
-    </w:p>
-    <w:p>
-      <w:pPr>
-        <w:pStyle w:val="ListParagraph"/>
-        <w:numPr>
-          <w:ilvl w:val="0"/>
-          <w:numId w:val="1"/>
-        </w:numPr>
-        <w:spacing w:after="60"/>
-      </w:pPr>
-      <w:r>
-        <w:t xml:space="preserve">Live-theme match: priority-1 'Copper &amp; electrification metals' and 'Grid / transmission equipment' (keyword 'cable' / 'conductor'), also priority-2 'EV ecosystem' - electrification-products layer; value_chain + growth_trajectory blocks added</w:t>
-      </w:r>
-    </w:p>
-    <w:p>
-      <w:pPr>
-        <w:pStyle w:val="ListParagraph"/>
-        <w:numPr>
-          <w:ilvl w:val="0"/>
-          <w:numId w:val="1"/>
-        </w:numPr>
-        <w:spacing w:after="60"/>
-      </w:pPr>
-      <w:r>
-        <w:t xml:space="preserve">revisit_after_30d false (conviction below Medium-High). Re-read after Q2 FY27 to see whether the volume/order backing and capex funding become concrete</w:t>
+        <w:t xml:space="preserve">Microcap LV-cable maker with a real revenue spike but a genuinely deteriorating cash-conversion picture (FY26 CFO Rs -27cr vs Rs10cr PAT, debtor days 72-&gt;155) -- thesis_fit 10x-in-2-3-years (UNCONFIRMED), conviction Low leaning cautious</w:t>
+      </w:r>
+    </w:p>
+    <w:p>
+      <w:pPr>
+        <w:pStyle w:val="ListParagraph"/>
+        <w:numPr>
+          <w:ilvl w:val="0"/>
+          <w:numId w:val="1"/>
+        </w:numPr>
+        <w:spacing w:after="60"/>
+      </w:pPr>
+      <w:r>
+        <w:t xml:space="preserve">Sovrenn Discovery seed; the Q1 FY27 +226% trigger is confirmed against filings, but management attributes it to mix + realisations rather than volume, so the datapoint remains a lead, not proof</w:t>
+      </w:r>
+    </w:p>
+    <w:p>
+      <w:pPr>
+        <w:pStyle w:val="ListParagraph"/>
+        <w:numPr>
+          <w:ilvl w:val="0"/>
+          <w:numId w:val="1"/>
+        </w:numPr>
+        <w:spacing w:after="60"/>
+      </w:pPr>
+      <w:r>
+        <w:t xml:space="preserve">Trailing-vs-inflection rule applied: weak multi-year history (Rs18.8cr FY23) + a strong specific recent quarter + a live sector catalyst (discom/grid T&amp;D capex, an integrated-facility plan) + microcap -&gt; thesis_fit 10x-in-2-3-years, marked UNCONFIRMED (four_box score 2.0, growth un-ignorable carve-out)</w:t>
+      </w:r>
+    </w:p>
+    <w:p>
+      <w:pPr>
+        <w:pStyle w:val="ListParagraph"/>
+        <w:numPr>
+          <w:ilvl w:val="0"/>
+          <w:numId w:val="1"/>
+        </w:numPr>
+        <w:spacing w:after="60"/>
+      </w:pPr>
+      <w:r>
+        <w:t xml:space="preserve">Conviction moved from Low-Medium to Low this pass: the deep dive found FY26 operating cash flow was Rs -27cr against Rs10cr PAT (a severe, newly-confirmed cash-conversion problem) with debtor days jumping 72-&gt;155 and PAT essentially flat YoY despite the revenue growth -- materially worse than the prior light-pass read</w:t>
+      </w:r>
+    </w:p>
+    <w:p>
+      <w:pPr>
+        <w:pStyle w:val="ListParagraph"/>
+        <w:numPr>
+          <w:ilvl w:val="0"/>
+          <w:numId w:val="1"/>
+        </w:numPr>
+        <w:spacing w:after="60"/>
+      </w:pPr>
+      <w:r>
+        <w:t xml:space="preserve">Two corrections to the prior pass: debt-to-equity is actually ~0.29 (not ~0.9), and the integrated-facility capex is partially IPO-funded (not wholly unfunded); promoter holding is rising (62.75%-&gt;65.59%), not falling -- these offset some of the newly-found cash-flow concern but do not resolve it</w:t>
+      </w:r>
+    </w:p>
+    <w:p>
+      <w:pPr>
+        <w:pStyle w:val="ListParagraph"/>
+        <w:numPr>
+          <w:ilvl w:val="0"/>
+          <w:numId w:val="1"/>
+        </w:numPr>
+        <w:spacing w:after="60"/>
+      </w:pPr>
+      <w:r>
+        <w:t xml:space="preserve">Live-theme match: priority-1 'Copper &amp; electrification metals' and 'Grid / transmission equipment' (keyword 'cable' / 'conductor'), also priority-2 'EV ecosystem' - electrification-products layer</w:t>
+      </w:r>
+    </w:p>
+    <w:p>
+      <w:pPr>
+        <w:pStyle w:val="ListParagraph"/>
+        <w:numPr>
+          <w:ilvl w:val="0"/>
+          <w:numId w:val="1"/>
+        </w:numPr>
+        <w:spacing w:after="60"/>
+      </w:pPr>
+      <w:r>
+        <w:t xml:space="preserve">revisit_after_30d false (conviction below Medium-High). Re-read after Q2 FY27 to see whether the working-capital position stabilises and whether the +226% quarter proves volume-backed</w:t>
       </w:r>
     </w:p>
     <w:p>

</xml_diff>